<commit_message>
perf: profile forward vs deferred baseline with frame debugger and gpu captures
</commit_message>
<xml_diff>
--- a/Docs/Rendering Profiling Pack.docx
+++ b/Docs/Rendering Profiling Pack.docx
@@ -94,7 +94,21 @@
         <w:rPr>
           <w:lang w:val="en-GB"/>
         </w:rPr>
-        <w:t>Opaque power boxes (from the TirgamesAssets Factory pack)</w:t>
+        <w:t xml:space="preserve">Opaque power boxes (from the </w:t>
+      </w:r>
+      <w:proofErr w:type="spellStart"/>
+      <w:r>
+        <w:rPr>
+          <w:lang w:val="en-GB"/>
+        </w:rPr>
+        <w:t>TirgamesAssets</w:t>
+      </w:r>
+      <w:proofErr w:type="spellEnd"/>
+      <w:r>
+        <w:rPr>
+          <w:lang w:val="en-GB"/>
+        </w:rPr>
+        <w:t xml:space="preserve"> Factory pack)</w:t>
       </w:r>
     </w:p>
     <w:p>
@@ -183,6 +197,7 @@
       </w:pPr>
       <w:r>
         <w:rPr>
+          <w:noProof/>
           <w:lang w:val="en-GB"/>
         </w:rPr>
         <w:drawing>
@@ -222,6 +237,2086 @@
         </w:drawing>
       </w:r>
     </w:p>
+    <w:p>
+      <w:pPr>
+        <w:rPr>
+          <w:lang w:val="en-GB"/>
+        </w:rPr>
+      </w:pPr>
+    </w:p>
+    <w:p>
+      <w:pPr>
+        <w:pStyle w:val="Heading1"/>
+        <w:rPr>
+          <w:lang w:val="en-GB"/>
+        </w:rPr>
+      </w:pPr>
+      <w:r>
+        <w:rPr>
+          <w:lang w:val="en-GB"/>
+        </w:rPr>
+        <w:t>Forward &amp; Deferred Rendering</w:t>
+      </w:r>
+    </w:p>
+    <w:tbl>
+      <w:tblPr>
+        <w:tblStyle w:val="GridTable5Dark-Accent1"/>
+        <w:tblW w:w="5000" w:type="pct"/>
+        <w:tblLook w:val="04A0" w:firstRow="1" w:lastRow="0" w:firstColumn="1" w:lastColumn="0" w:noHBand="0" w:noVBand="1"/>
+      </w:tblPr>
+      <w:tblGrid>
+        <w:gridCol w:w="1162"/>
+        <w:gridCol w:w="3941"/>
+        <w:gridCol w:w="3913"/>
+      </w:tblGrid>
+      <w:tr>
+        <w:trPr>
+          <w:cnfStyle w:val="100000000000" w:firstRow="1" w:lastRow="0" w:firstColumn="0" w:lastColumn="0" w:oddVBand="0" w:evenVBand="0" w:oddHBand="0" w:evenHBand="0" w:firstRowFirstColumn="0" w:firstRowLastColumn="0" w:lastRowFirstColumn="0" w:lastRowLastColumn="0"/>
+        </w:trPr>
+        <w:tc>
+          <w:tcPr>
+            <w:cnfStyle w:val="001000000000" w:firstRow="0" w:lastRow="0" w:firstColumn="1" w:lastColumn="0" w:oddVBand="0" w:evenVBand="0" w:oddHBand="0" w:evenHBand="0" w:firstRowFirstColumn="0" w:firstRowLastColumn="0" w:lastRowFirstColumn="0" w:lastRowLastColumn="0"/>
+            <w:tcW w:w="549" w:type="pct"/>
+            <w:vAlign w:val="center"/>
+          </w:tcPr>
+          <w:p>
+            <w:pPr>
+              <w:jc w:val="center"/>
+              <w:rPr>
+                <w:lang w:val="en-GB"/>
+              </w:rPr>
+            </w:pPr>
+          </w:p>
+        </w:tc>
+        <w:tc>
+          <w:tcPr>
+            <w:tcW w:w="2548" w:type="pct"/>
+            <w:vAlign w:val="center"/>
+          </w:tcPr>
+          <w:p>
+            <w:pPr>
+              <w:jc w:val="center"/>
+              <w:cnfStyle w:val="100000000000" w:firstRow="1" w:lastRow="0" w:firstColumn="0" w:lastColumn="0" w:oddVBand="0" w:evenVBand="0" w:oddHBand="0" w:evenHBand="0" w:firstRowFirstColumn="0" w:firstRowLastColumn="0" w:lastRowFirstColumn="0" w:lastRowLastColumn="0"/>
+              <w:rPr>
+                <w:lang w:val="en-GB"/>
+              </w:rPr>
+            </w:pPr>
+            <w:r>
+              <w:rPr>
+                <w:lang w:val="en-GB"/>
+              </w:rPr>
+              <w:t>Forward</w:t>
+            </w:r>
+          </w:p>
+        </w:tc>
+        <w:tc>
+          <w:tcPr>
+            <w:tcW w:w="1903" w:type="pct"/>
+            <w:vAlign w:val="center"/>
+          </w:tcPr>
+          <w:p>
+            <w:pPr>
+              <w:jc w:val="center"/>
+              <w:cnfStyle w:val="100000000000" w:firstRow="1" w:lastRow="0" w:firstColumn="0" w:lastColumn="0" w:oddVBand="0" w:evenVBand="0" w:oddHBand="0" w:evenHBand="0" w:firstRowFirstColumn="0" w:firstRowLastColumn="0" w:lastRowFirstColumn="0" w:lastRowLastColumn="0"/>
+              <w:rPr>
+                <w:lang w:val="en-GB"/>
+              </w:rPr>
+            </w:pPr>
+            <w:r>
+              <w:rPr>
+                <w:lang w:val="en-GB"/>
+              </w:rPr>
+              <w:t>Deferred</w:t>
+            </w:r>
+          </w:p>
+        </w:tc>
+      </w:tr>
+      <w:tr>
+        <w:trPr>
+          <w:cnfStyle w:val="000000100000" w:firstRow="0" w:lastRow="0" w:firstColumn="0" w:lastColumn="0" w:oddVBand="0" w:evenVBand="0" w:oddHBand="1" w:evenHBand="0" w:firstRowFirstColumn="0" w:firstRowLastColumn="0" w:lastRowFirstColumn="0" w:lastRowLastColumn="0"/>
+        </w:trPr>
+        <w:tc>
+          <w:tcPr>
+            <w:cnfStyle w:val="001000000000" w:firstRow="0" w:lastRow="0" w:firstColumn="1" w:lastColumn="0" w:oddVBand="0" w:evenVBand="0" w:oddHBand="0" w:evenHBand="0" w:firstRowFirstColumn="0" w:firstRowLastColumn="0" w:lastRowFirstColumn="0" w:lastRowLastColumn="0"/>
+            <w:tcW w:w="549" w:type="pct"/>
+            <w:vAlign w:val="center"/>
+          </w:tcPr>
+          <w:p>
+            <w:pPr>
+              <w:jc w:val="center"/>
+              <w:rPr>
+                <w:lang w:val="en-GB"/>
+              </w:rPr>
+            </w:pPr>
+            <w:r>
+              <w:rPr>
+                <w:lang w:val="en-GB"/>
+              </w:rPr>
+              <w:lastRenderedPageBreak/>
+              <w:t>Inspector</w:t>
+            </w:r>
+          </w:p>
+        </w:tc>
+        <w:tc>
+          <w:tcPr>
+            <w:tcW w:w="2548" w:type="pct"/>
+            <w:vAlign w:val="center"/>
+          </w:tcPr>
+          <w:p>
+            <w:pPr>
+              <w:jc w:val="center"/>
+              <w:cnfStyle w:val="000000100000" w:firstRow="0" w:lastRow="0" w:firstColumn="0" w:lastColumn="0" w:oddVBand="0" w:evenVBand="0" w:oddHBand="1" w:evenHBand="0" w:firstRowFirstColumn="0" w:firstRowLastColumn="0" w:lastRowFirstColumn="0" w:lastRowLastColumn="0"/>
+              <w:rPr>
+                <w:lang w:val="en-GB"/>
+              </w:rPr>
+            </w:pPr>
+            <w:r>
+              <w:rPr>
+                <w:noProof/>
+                <w:lang w:val="en-GB"/>
+              </w:rPr>
+              <w:drawing>
+                <wp:inline distT="0" distB="0" distL="0" distR="0" wp14:anchorId="221E0A4A" wp14:editId="103CAAA4">
+                  <wp:extent cx="1987550" cy="3244252"/>
+                  <wp:effectExtent l="0" t="0" r="0" b="0"/>
+                  <wp:docPr id="2126083952" name="Picture 1"/>
+                  <wp:cNvGraphicFramePr>
+                    <a:graphicFrameLocks xmlns:a="http://schemas.openxmlformats.org/drawingml/2006/main" noChangeAspect="1"/>
+                  </wp:cNvGraphicFramePr>
+                  <a:graphic xmlns:a="http://schemas.openxmlformats.org/drawingml/2006/main">
+                    <a:graphicData uri="http://schemas.openxmlformats.org/drawingml/2006/picture">
+                      <pic:pic xmlns:pic="http://schemas.openxmlformats.org/drawingml/2006/picture">
+                        <pic:nvPicPr>
+                          <pic:cNvPr id="2126083952" name=""/>
+                          <pic:cNvPicPr/>
+                        </pic:nvPicPr>
+                        <pic:blipFill>
+                          <a:blip r:embed="rId6"/>
+                          <a:stretch>
+                            <a:fillRect/>
+                          </a:stretch>
+                        </pic:blipFill>
+                        <pic:spPr>
+                          <a:xfrm>
+                            <a:off x="0" y="0"/>
+                            <a:ext cx="1998987" cy="3262921"/>
+                          </a:xfrm>
+                          <a:prstGeom prst="rect">
+                            <a:avLst/>
+                          </a:prstGeom>
+                        </pic:spPr>
+                      </pic:pic>
+                    </a:graphicData>
+                  </a:graphic>
+                </wp:inline>
+              </w:drawing>
+            </w:r>
+          </w:p>
+        </w:tc>
+        <w:tc>
+          <w:tcPr>
+            <w:tcW w:w="1903" w:type="pct"/>
+            <w:vAlign w:val="center"/>
+          </w:tcPr>
+          <w:p>
+            <w:pPr>
+              <w:jc w:val="center"/>
+              <w:cnfStyle w:val="000000100000" w:firstRow="0" w:lastRow="0" w:firstColumn="0" w:lastColumn="0" w:oddVBand="0" w:evenVBand="0" w:oddHBand="1" w:evenHBand="0" w:firstRowFirstColumn="0" w:firstRowLastColumn="0" w:lastRowFirstColumn="0" w:lastRowLastColumn="0"/>
+              <w:rPr>
+                <w:lang w:val="en-GB"/>
+              </w:rPr>
+            </w:pPr>
+            <w:r>
+              <w:rPr>
+                <w:noProof/>
+                <w:lang w:val="en-GB"/>
+              </w:rPr>
+              <w:drawing>
+                <wp:inline distT="0" distB="0" distL="0" distR="0" wp14:anchorId="317BB1C0" wp14:editId="2273C629">
+                  <wp:extent cx="2264084" cy="3238500"/>
+                  <wp:effectExtent l="0" t="0" r="3175" b="0"/>
+                  <wp:docPr id="1268798661" name="Picture 1"/>
+                  <wp:cNvGraphicFramePr>
+                    <a:graphicFrameLocks xmlns:a="http://schemas.openxmlformats.org/drawingml/2006/main" noChangeAspect="1"/>
+                  </wp:cNvGraphicFramePr>
+                  <a:graphic xmlns:a="http://schemas.openxmlformats.org/drawingml/2006/main">
+                    <a:graphicData uri="http://schemas.openxmlformats.org/drawingml/2006/picture">
+                      <pic:pic xmlns:pic="http://schemas.openxmlformats.org/drawingml/2006/picture">
+                        <pic:nvPicPr>
+                          <pic:cNvPr id="1268798661" name=""/>
+                          <pic:cNvPicPr/>
+                        </pic:nvPicPr>
+                        <pic:blipFill>
+                          <a:blip r:embed="rId7"/>
+                          <a:stretch>
+                            <a:fillRect/>
+                          </a:stretch>
+                        </pic:blipFill>
+                        <pic:spPr>
+                          <a:xfrm>
+                            <a:off x="0" y="0"/>
+                            <a:ext cx="2275888" cy="3255384"/>
+                          </a:xfrm>
+                          <a:prstGeom prst="rect">
+                            <a:avLst/>
+                          </a:prstGeom>
+                        </pic:spPr>
+                      </pic:pic>
+                    </a:graphicData>
+                  </a:graphic>
+                </wp:inline>
+              </w:drawing>
+            </w:r>
+          </w:p>
+        </w:tc>
+      </w:tr>
+      <w:tr>
+        <w:tc>
+          <w:tcPr>
+            <w:cnfStyle w:val="001000000000" w:firstRow="0" w:lastRow="0" w:firstColumn="1" w:lastColumn="0" w:oddVBand="0" w:evenVBand="0" w:oddHBand="0" w:evenHBand="0" w:firstRowFirstColumn="0" w:firstRowLastColumn="0" w:lastRowFirstColumn="0" w:lastRowLastColumn="0"/>
+            <w:tcW w:w="549" w:type="pct"/>
+            <w:vAlign w:val="center"/>
+          </w:tcPr>
+          <w:p>
+            <w:pPr>
+              <w:jc w:val="center"/>
+              <w:rPr>
+                <w:lang w:val="en-GB"/>
+              </w:rPr>
+            </w:pPr>
+            <w:r>
+              <w:rPr>
+                <w:lang w:val="en-GB"/>
+              </w:rPr>
+              <w:t>Frame Debugger</w:t>
+            </w:r>
+          </w:p>
+        </w:tc>
+        <w:tc>
+          <w:tcPr>
+            <w:tcW w:w="2548" w:type="pct"/>
+            <w:vAlign w:val="center"/>
+          </w:tcPr>
+          <w:p>
+            <w:pPr>
+              <w:jc w:val="center"/>
+              <w:cnfStyle w:val="000000000000" w:firstRow="0" w:lastRow="0" w:firstColumn="0" w:lastColumn="0" w:oddVBand="0" w:evenVBand="0" w:oddHBand="0" w:evenHBand="0" w:firstRowFirstColumn="0" w:firstRowLastColumn="0" w:lastRowFirstColumn="0" w:lastRowLastColumn="0"/>
+              <w:rPr>
+                <w:lang w:val="en-GB"/>
+              </w:rPr>
+            </w:pPr>
+            <w:r>
+              <w:rPr>
+                <w:noProof/>
+                <w:lang w:val="en-GB"/>
+              </w:rPr>
+              <w:drawing>
+                <wp:inline distT="0" distB="0" distL="0" distR="0" wp14:anchorId="74C44CBC" wp14:editId="67DA2A6A">
+                  <wp:extent cx="2406650" cy="2830379"/>
+                  <wp:effectExtent l="0" t="0" r="0" b="8255"/>
+                  <wp:docPr id="66476354" name="Picture 1"/>
+                  <wp:cNvGraphicFramePr>
+                    <a:graphicFrameLocks xmlns:a="http://schemas.openxmlformats.org/drawingml/2006/main" noChangeAspect="1"/>
+                  </wp:cNvGraphicFramePr>
+                  <a:graphic xmlns:a="http://schemas.openxmlformats.org/drawingml/2006/main">
+                    <a:graphicData uri="http://schemas.openxmlformats.org/drawingml/2006/picture">
+                      <pic:pic xmlns:pic="http://schemas.openxmlformats.org/drawingml/2006/picture">
+                        <pic:nvPicPr>
+                          <pic:cNvPr id="66476354" name=""/>
+                          <pic:cNvPicPr/>
+                        </pic:nvPicPr>
+                        <pic:blipFill>
+                          <a:blip r:embed="rId8"/>
+                          <a:stretch>
+                            <a:fillRect/>
+                          </a:stretch>
+                        </pic:blipFill>
+                        <pic:spPr>
+                          <a:xfrm>
+                            <a:off x="0" y="0"/>
+                            <a:ext cx="2413373" cy="2838285"/>
+                          </a:xfrm>
+                          <a:prstGeom prst="rect">
+                            <a:avLst/>
+                          </a:prstGeom>
+                        </pic:spPr>
+                      </pic:pic>
+                    </a:graphicData>
+                  </a:graphic>
+                </wp:inline>
+              </w:drawing>
+            </w:r>
+          </w:p>
+        </w:tc>
+        <w:tc>
+          <w:tcPr>
+            <w:tcW w:w="1903" w:type="pct"/>
+            <w:vAlign w:val="center"/>
+          </w:tcPr>
+          <w:p>
+            <w:pPr>
+              <w:jc w:val="center"/>
+              <w:cnfStyle w:val="000000000000" w:firstRow="0" w:lastRow="0" w:firstColumn="0" w:lastColumn="0" w:oddVBand="0" w:evenVBand="0" w:oddHBand="0" w:evenHBand="0" w:firstRowFirstColumn="0" w:firstRowLastColumn="0" w:lastRowFirstColumn="0" w:lastRowLastColumn="0"/>
+              <w:rPr>
+                <w:lang w:val="en-GB"/>
+              </w:rPr>
+            </w:pPr>
+            <w:r>
+              <w:rPr>
+                <w:noProof/>
+                <w:lang w:val="en-GB"/>
+              </w:rPr>
+              <w:drawing>
+                <wp:inline distT="0" distB="0" distL="0" distR="0" wp14:anchorId="3DE47FA0" wp14:editId="74015C68">
+                  <wp:extent cx="2139950" cy="2856924"/>
+                  <wp:effectExtent l="0" t="0" r="0" b="635"/>
+                  <wp:docPr id="25115273" name="Picture 1"/>
+                  <wp:cNvGraphicFramePr>
+                    <a:graphicFrameLocks xmlns:a="http://schemas.openxmlformats.org/drawingml/2006/main" noChangeAspect="1"/>
+                  </wp:cNvGraphicFramePr>
+                  <a:graphic xmlns:a="http://schemas.openxmlformats.org/drawingml/2006/main">
+                    <a:graphicData uri="http://schemas.openxmlformats.org/drawingml/2006/picture">
+                      <pic:pic xmlns:pic="http://schemas.openxmlformats.org/drawingml/2006/picture">
+                        <pic:nvPicPr>
+                          <pic:cNvPr id="25115273" name=""/>
+                          <pic:cNvPicPr/>
+                        </pic:nvPicPr>
+                        <pic:blipFill>
+                          <a:blip r:embed="rId9"/>
+                          <a:stretch>
+                            <a:fillRect/>
+                          </a:stretch>
+                        </pic:blipFill>
+                        <pic:spPr>
+                          <a:xfrm>
+                            <a:off x="0" y="0"/>
+                            <a:ext cx="2147402" cy="2866872"/>
+                          </a:xfrm>
+                          <a:prstGeom prst="rect">
+                            <a:avLst/>
+                          </a:prstGeom>
+                        </pic:spPr>
+                      </pic:pic>
+                    </a:graphicData>
+                  </a:graphic>
+                </wp:inline>
+              </w:drawing>
+            </w:r>
+          </w:p>
+        </w:tc>
+      </w:tr>
+      <w:tr>
+        <w:trPr>
+          <w:cnfStyle w:val="000000100000" w:firstRow="0" w:lastRow="0" w:firstColumn="0" w:lastColumn="0" w:oddVBand="0" w:evenVBand="0" w:oddHBand="1" w:evenHBand="0" w:firstRowFirstColumn="0" w:firstRowLastColumn="0" w:lastRowFirstColumn="0" w:lastRowLastColumn="0"/>
+        </w:trPr>
+        <w:tc>
+          <w:tcPr>
+            <w:cnfStyle w:val="001000000000" w:firstRow="0" w:lastRow="0" w:firstColumn="1" w:lastColumn="0" w:oddVBand="0" w:evenVBand="0" w:oddHBand="0" w:evenHBand="0" w:firstRowFirstColumn="0" w:firstRowLastColumn="0" w:lastRowFirstColumn="0" w:lastRowLastColumn="0"/>
+            <w:tcW w:w="549" w:type="pct"/>
+            <w:vAlign w:val="center"/>
+          </w:tcPr>
+          <w:p>
+            <w:pPr>
+              <w:jc w:val="center"/>
+              <w:rPr>
+                <w:lang w:val="en-GB"/>
+              </w:rPr>
+            </w:pPr>
+            <w:r>
+              <w:rPr>
+                <w:lang w:val="en-GB"/>
+              </w:rPr>
+              <w:t>Game View</w:t>
+            </w:r>
+          </w:p>
+        </w:tc>
+        <w:tc>
+          <w:tcPr>
+            <w:tcW w:w="2548" w:type="pct"/>
+            <w:vAlign w:val="center"/>
+          </w:tcPr>
+          <w:p>
+            <w:pPr>
+              <w:jc w:val="center"/>
+              <w:cnfStyle w:val="000000100000" w:firstRow="0" w:lastRow="0" w:firstColumn="0" w:lastColumn="0" w:oddVBand="0" w:evenVBand="0" w:oddHBand="1" w:evenHBand="0" w:firstRowFirstColumn="0" w:firstRowLastColumn="0" w:lastRowFirstColumn="0" w:lastRowLastColumn="0"/>
+              <w:rPr>
+                <w:lang w:val="en-GB"/>
+              </w:rPr>
+            </w:pPr>
+            <w:r>
+              <w:rPr>
+                <w:lang w:val="en-GB"/>
+              </w:rPr>
+              <w:drawing>
+                <wp:inline distT="0" distB="0" distL="0" distR="0" wp14:anchorId="407B043E" wp14:editId="60935D05">
+                  <wp:extent cx="1923889" cy="2640925"/>
+                  <wp:effectExtent l="0" t="0" r="635" b="7620"/>
+                  <wp:docPr id="1599147878" name="Picture 1"/>
+                  <wp:cNvGraphicFramePr>
+                    <a:graphicFrameLocks xmlns:a="http://schemas.openxmlformats.org/drawingml/2006/main" noChangeAspect="1"/>
+                  </wp:cNvGraphicFramePr>
+                  <a:graphic xmlns:a="http://schemas.openxmlformats.org/drawingml/2006/main">
+                    <a:graphicData uri="http://schemas.openxmlformats.org/drawingml/2006/picture">
+                      <pic:pic xmlns:pic="http://schemas.openxmlformats.org/drawingml/2006/picture">
+                        <pic:nvPicPr>
+                          <pic:cNvPr id="1599147878" name=""/>
+                          <pic:cNvPicPr/>
+                        </pic:nvPicPr>
+                        <pic:blipFill>
+                          <a:blip r:embed="rId10"/>
+                          <a:stretch>
+                            <a:fillRect/>
+                          </a:stretch>
+                        </pic:blipFill>
+                        <pic:spPr>
+                          <a:xfrm>
+                            <a:off x="0" y="0"/>
+                            <a:ext cx="1968808" cy="2702585"/>
+                          </a:xfrm>
+                          <a:prstGeom prst="rect">
+                            <a:avLst/>
+                          </a:prstGeom>
+                        </pic:spPr>
+                      </pic:pic>
+                    </a:graphicData>
+                  </a:graphic>
+                </wp:inline>
+              </w:drawing>
+            </w:r>
+          </w:p>
+        </w:tc>
+        <w:tc>
+          <w:tcPr>
+            <w:tcW w:w="1903" w:type="pct"/>
+            <w:vAlign w:val="center"/>
+          </w:tcPr>
+          <w:p>
+            <w:pPr>
+              <w:jc w:val="center"/>
+              <w:cnfStyle w:val="000000100000" w:firstRow="0" w:lastRow="0" w:firstColumn="0" w:lastColumn="0" w:oddVBand="0" w:evenVBand="0" w:oddHBand="1" w:evenHBand="0" w:firstRowFirstColumn="0" w:firstRowLastColumn="0" w:lastRowFirstColumn="0" w:lastRowLastColumn="0"/>
+              <w:rPr>
+                <w:lang w:val="en-GB"/>
+              </w:rPr>
+            </w:pPr>
+            <w:r>
+              <w:rPr>
+                <w:lang w:val="en-GB"/>
+              </w:rPr>
+              <w:drawing>
+                <wp:inline distT="0" distB="0" distL="0" distR="0" wp14:anchorId="472F1E0F" wp14:editId="315DB897">
+                  <wp:extent cx="1885696" cy="2622968"/>
+                  <wp:effectExtent l="0" t="0" r="635" b="6350"/>
+                  <wp:docPr id="1970936767" name="Picture 1"/>
+                  <wp:cNvGraphicFramePr>
+                    <a:graphicFrameLocks xmlns:a="http://schemas.openxmlformats.org/drawingml/2006/main" noChangeAspect="1"/>
+                  </wp:cNvGraphicFramePr>
+                  <a:graphic xmlns:a="http://schemas.openxmlformats.org/drawingml/2006/main">
+                    <a:graphicData uri="http://schemas.openxmlformats.org/drawingml/2006/picture">
+                      <pic:pic xmlns:pic="http://schemas.openxmlformats.org/drawingml/2006/picture">
+                        <pic:nvPicPr>
+                          <pic:cNvPr id="1970936767" name=""/>
+                          <pic:cNvPicPr/>
+                        </pic:nvPicPr>
+                        <pic:blipFill>
+                          <a:blip r:embed="rId11"/>
+                          <a:stretch>
+                            <a:fillRect/>
+                          </a:stretch>
+                        </pic:blipFill>
+                        <pic:spPr>
+                          <a:xfrm>
+                            <a:off x="0" y="0"/>
+                            <a:ext cx="1917860" cy="2667708"/>
+                          </a:xfrm>
+                          <a:prstGeom prst="rect">
+                            <a:avLst/>
+                          </a:prstGeom>
+                        </pic:spPr>
+                      </pic:pic>
+                    </a:graphicData>
+                  </a:graphic>
+                </wp:inline>
+              </w:drawing>
+            </w:r>
+          </w:p>
+        </w:tc>
+      </w:tr>
+      <w:tr>
+        <w:tc>
+          <w:tcPr>
+            <w:cnfStyle w:val="001000000000" w:firstRow="0" w:lastRow="0" w:firstColumn="1" w:lastColumn="0" w:oddVBand="0" w:evenVBand="0" w:oddHBand="0" w:evenHBand="0" w:firstRowFirstColumn="0" w:firstRowLastColumn="0" w:lastRowFirstColumn="0" w:lastRowLastColumn="0"/>
+            <w:tcW w:w="549" w:type="pct"/>
+            <w:vAlign w:val="center"/>
+          </w:tcPr>
+          <w:p>
+            <w:pPr>
+              <w:jc w:val="center"/>
+              <w:rPr>
+                <w:lang w:val="en-GB"/>
+              </w:rPr>
+            </w:pPr>
+            <w:r>
+              <w:rPr>
+                <w:lang w:val="en-GB"/>
+              </w:rPr>
+              <w:lastRenderedPageBreak/>
+              <w:t>GPU Profiling</w:t>
+            </w:r>
+          </w:p>
+        </w:tc>
+        <w:tc>
+          <w:tcPr>
+            <w:tcW w:w="2548" w:type="pct"/>
+            <w:vAlign w:val="center"/>
+          </w:tcPr>
+          <w:p>
+            <w:pPr>
+              <w:jc w:val="center"/>
+              <w:cnfStyle w:val="000000000000" w:firstRow="0" w:lastRow="0" w:firstColumn="0" w:lastColumn="0" w:oddVBand="0" w:evenVBand="0" w:oddHBand="0" w:evenHBand="0" w:firstRowFirstColumn="0" w:firstRowLastColumn="0" w:lastRowFirstColumn="0" w:lastRowLastColumn="0"/>
+              <w:rPr>
+                <w:lang w:val="en-GB"/>
+              </w:rPr>
+            </w:pPr>
+            <w:r>
+              <w:rPr>
+                <w:lang w:val="en-GB"/>
+              </w:rPr>
+              <w:drawing>
+                <wp:inline distT="0" distB="0" distL="0" distR="0" wp14:anchorId="046F6AA9" wp14:editId="582F113F">
+                  <wp:extent cx="2311400" cy="1207685"/>
+                  <wp:effectExtent l="0" t="0" r="0" b="0"/>
+                  <wp:docPr id="796606307" name="Picture 1"/>
+                  <wp:cNvGraphicFramePr>
+                    <a:graphicFrameLocks xmlns:a="http://schemas.openxmlformats.org/drawingml/2006/main" noChangeAspect="1"/>
+                  </wp:cNvGraphicFramePr>
+                  <a:graphic xmlns:a="http://schemas.openxmlformats.org/drawingml/2006/main">
+                    <a:graphicData uri="http://schemas.openxmlformats.org/drawingml/2006/picture">
+                      <pic:pic xmlns:pic="http://schemas.openxmlformats.org/drawingml/2006/picture">
+                        <pic:nvPicPr>
+                          <pic:cNvPr id="796606307" name=""/>
+                          <pic:cNvPicPr/>
+                        </pic:nvPicPr>
+                        <pic:blipFill>
+                          <a:blip r:embed="rId12"/>
+                          <a:stretch>
+                            <a:fillRect/>
+                          </a:stretch>
+                        </pic:blipFill>
+                        <pic:spPr>
+                          <a:xfrm>
+                            <a:off x="0" y="0"/>
+                            <a:ext cx="2329443" cy="1217112"/>
+                          </a:xfrm>
+                          <a:prstGeom prst="rect">
+                            <a:avLst/>
+                          </a:prstGeom>
+                        </pic:spPr>
+                      </pic:pic>
+                    </a:graphicData>
+                  </a:graphic>
+                </wp:inline>
+              </w:drawing>
+            </w:r>
+          </w:p>
+        </w:tc>
+        <w:tc>
+          <w:tcPr>
+            <w:tcW w:w="1903" w:type="pct"/>
+            <w:vAlign w:val="center"/>
+          </w:tcPr>
+          <w:p>
+            <w:pPr>
+              <w:jc w:val="center"/>
+              <w:cnfStyle w:val="000000000000" w:firstRow="0" w:lastRow="0" w:firstColumn="0" w:lastColumn="0" w:oddVBand="0" w:evenVBand="0" w:oddHBand="0" w:evenHBand="0" w:firstRowFirstColumn="0" w:firstRowLastColumn="0" w:lastRowFirstColumn="0" w:lastRowLastColumn="0"/>
+              <w:rPr>
+                <w:lang w:val="en-GB"/>
+              </w:rPr>
+            </w:pPr>
+            <w:r>
+              <w:rPr>
+                <w:lang w:val="en-GB"/>
+              </w:rPr>
+              <w:drawing>
+                <wp:inline distT="0" distB="0" distL="0" distR="0" wp14:anchorId="38175FB9" wp14:editId="3C7728F9">
+                  <wp:extent cx="2388946" cy="1200825"/>
+                  <wp:effectExtent l="0" t="0" r="0" b="0"/>
+                  <wp:docPr id="934917372" name="Picture 1"/>
+                  <wp:cNvGraphicFramePr>
+                    <a:graphicFrameLocks xmlns:a="http://schemas.openxmlformats.org/drawingml/2006/main" noChangeAspect="1"/>
+                  </wp:cNvGraphicFramePr>
+                  <a:graphic xmlns:a="http://schemas.openxmlformats.org/drawingml/2006/main">
+                    <a:graphicData uri="http://schemas.openxmlformats.org/drawingml/2006/picture">
+                      <pic:pic xmlns:pic="http://schemas.openxmlformats.org/drawingml/2006/picture">
+                        <pic:nvPicPr>
+                          <pic:cNvPr id="934917372" name=""/>
+                          <pic:cNvPicPr/>
+                        </pic:nvPicPr>
+                        <pic:blipFill>
+                          <a:blip r:embed="rId13"/>
+                          <a:stretch>
+                            <a:fillRect/>
+                          </a:stretch>
+                        </pic:blipFill>
+                        <pic:spPr>
+                          <a:xfrm>
+                            <a:off x="0" y="0"/>
+                            <a:ext cx="2420692" cy="1216783"/>
+                          </a:xfrm>
+                          <a:prstGeom prst="rect">
+                            <a:avLst/>
+                          </a:prstGeom>
+                        </pic:spPr>
+                      </pic:pic>
+                    </a:graphicData>
+                  </a:graphic>
+                </wp:inline>
+              </w:drawing>
+            </w:r>
+          </w:p>
+        </w:tc>
+      </w:tr>
+      <w:tr>
+        <w:trPr>
+          <w:cnfStyle w:val="000000100000" w:firstRow="0" w:lastRow="0" w:firstColumn="0" w:lastColumn="0" w:oddVBand="0" w:evenVBand="0" w:oddHBand="1" w:evenHBand="0" w:firstRowFirstColumn="0" w:firstRowLastColumn="0" w:lastRowFirstColumn="0" w:lastRowLastColumn="0"/>
+        </w:trPr>
+        <w:tc>
+          <w:tcPr>
+            <w:cnfStyle w:val="001000000000" w:firstRow="0" w:lastRow="0" w:firstColumn="1" w:lastColumn="0" w:oddVBand="0" w:evenVBand="0" w:oddHBand="0" w:evenHBand="0" w:firstRowFirstColumn="0" w:firstRowLastColumn="0" w:lastRowFirstColumn="0" w:lastRowLastColumn="0"/>
+            <w:tcW w:w="549" w:type="pct"/>
+            <w:vAlign w:val="center"/>
+          </w:tcPr>
+          <w:p>
+            <w:pPr>
+              <w:jc w:val="center"/>
+              <w:rPr>
+                <w:lang w:val="en-GB"/>
+              </w:rPr>
+            </w:pPr>
+            <w:r>
+              <w:rPr>
+                <w:lang w:val="en-GB"/>
+              </w:rPr>
+              <w:t>Overdraw</w:t>
+            </w:r>
+          </w:p>
+        </w:tc>
+        <w:tc>
+          <w:tcPr>
+            <w:tcW w:w="2548" w:type="pct"/>
+            <w:vAlign w:val="center"/>
+          </w:tcPr>
+          <w:p>
+            <w:pPr>
+              <w:jc w:val="center"/>
+              <w:cnfStyle w:val="000000100000" w:firstRow="0" w:lastRow="0" w:firstColumn="0" w:lastColumn="0" w:oddVBand="0" w:evenVBand="0" w:oddHBand="1" w:evenHBand="0" w:firstRowFirstColumn="0" w:firstRowLastColumn="0" w:lastRowFirstColumn="0" w:lastRowLastColumn="0"/>
+              <w:rPr>
+                <w:lang w:val="en-GB"/>
+              </w:rPr>
+            </w:pPr>
+            <w:r>
+              <w:rPr>
+                <w:lang w:val="en-GB"/>
+              </w:rPr>
+              <w:drawing>
+                <wp:inline distT="0" distB="0" distL="0" distR="0" wp14:anchorId="4F467483" wp14:editId="5C715004">
+                  <wp:extent cx="2336800" cy="2234277"/>
+                  <wp:effectExtent l="0" t="0" r="6350" b="0"/>
+                  <wp:docPr id="673471275" name="Picture 1"/>
+                  <wp:cNvGraphicFramePr>
+                    <a:graphicFrameLocks xmlns:a="http://schemas.openxmlformats.org/drawingml/2006/main" noChangeAspect="1"/>
+                  </wp:cNvGraphicFramePr>
+                  <a:graphic xmlns:a="http://schemas.openxmlformats.org/drawingml/2006/main">
+                    <a:graphicData uri="http://schemas.openxmlformats.org/drawingml/2006/picture">
+                      <pic:pic xmlns:pic="http://schemas.openxmlformats.org/drawingml/2006/picture">
+                        <pic:nvPicPr>
+                          <pic:cNvPr id="673471275" name=""/>
+                          <pic:cNvPicPr/>
+                        </pic:nvPicPr>
+                        <pic:blipFill>
+                          <a:blip r:embed="rId14"/>
+                          <a:stretch>
+                            <a:fillRect/>
+                          </a:stretch>
+                        </pic:blipFill>
+                        <pic:spPr>
+                          <a:xfrm>
+                            <a:off x="0" y="0"/>
+                            <a:ext cx="2347305" cy="2244322"/>
+                          </a:xfrm>
+                          <a:prstGeom prst="rect">
+                            <a:avLst/>
+                          </a:prstGeom>
+                        </pic:spPr>
+                      </pic:pic>
+                    </a:graphicData>
+                  </a:graphic>
+                </wp:inline>
+              </w:drawing>
+            </w:r>
+          </w:p>
+        </w:tc>
+        <w:tc>
+          <w:tcPr>
+            <w:tcW w:w="1903" w:type="pct"/>
+            <w:vAlign w:val="center"/>
+          </w:tcPr>
+          <w:p>
+            <w:pPr>
+              <w:jc w:val="center"/>
+              <w:cnfStyle w:val="000000100000" w:firstRow="0" w:lastRow="0" w:firstColumn="0" w:lastColumn="0" w:oddVBand="0" w:evenVBand="0" w:oddHBand="1" w:evenHBand="0" w:firstRowFirstColumn="0" w:firstRowLastColumn="0" w:lastRowFirstColumn="0" w:lastRowLastColumn="0"/>
+              <w:rPr>
+                <w:lang w:val="en-GB"/>
+              </w:rPr>
+            </w:pPr>
+            <w:r>
+              <w:rPr>
+                <w:lang w:val="en-GB"/>
+              </w:rPr>
+              <w:drawing>
+                <wp:inline distT="0" distB="0" distL="0" distR="0" wp14:anchorId="38D186E7" wp14:editId="27CE7766">
+                  <wp:extent cx="2384232" cy="2266950"/>
+                  <wp:effectExtent l="0" t="0" r="0" b="0"/>
+                  <wp:docPr id="411697473" name="Picture 1"/>
+                  <wp:cNvGraphicFramePr>
+                    <a:graphicFrameLocks xmlns:a="http://schemas.openxmlformats.org/drawingml/2006/main" noChangeAspect="1"/>
+                  </wp:cNvGraphicFramePr>
+                  <a:graphic xmlns:a="http://schemas.openxmlformats.org/drawingml/2006/main">
+                    <a:graphicData uri="http://schemas.openxmlformats.org/drawingml/2006/picture">
+                      <pic:pic xmlns:pic="http://schemas.openxmlformats.org/drawingml/2006/picture">
+                        <pic:nvPicPr>
+                          <pic:cNvPr id="411697473" name=""/>
+                          <pic:cNvPicPr/>
+                        </pic:nvPicPr>
+                        <pic:blipFill>
+                          <a:blip r:embed="rId15"/>
+                          <a:stretch>
+                            <a:fillRect/>
+                          </a:stretch>
+                        </pic:blipFill>
+                        <pic:spPr>
+                          <a:xfrm>
+                            <a:off x="0" y="0"/>
+                            <a:ext cx="2410231" cy="2291670"/>
+                          </a:xfrm>
+                          <a:prstGeom prst="rect">
+                            <a:avLst/>
+                          </a:prstGeom>
+                        </pic:spPr>
+                      </pic:pic>
+                    </a:graphicData>
+                  </a:graphic>
+                </wp:inline>
+              </w:drawing>
+            </w:r>
+          </w:p>
+        </w:tc>
+      </w:tr>
+    </w:tbl>
+    <w:p>
+      <w:pPr>
+        <w:rPr>
+          <w:lang w:val="en-GB"/>
+        </w:rPr>
+      </w:pPr>
+    </w:p>
+    <w:p>
+      <w:pPr>
+        <w:rPr>
+          <w:lang w:val="en-GB"/>
+        </w:rPr>
+      </w:pPr>
+      <w:r>
+        <w:rPr>
+          <w:lang w:val="en-GB"/>
+        </w:rPr>
+        <w:t xml:space="preserve">In this controlled scene (1 opaque + 1 alpha-tested foliage + 4 lights), </w:t>
+      </w:r>
+      <w:r>
+        <w:rPr>
+          <w:lang w:val="en-GB"/>
+        </w:rPr>
+        <w:t>d</w:t>
+      </w:r>
+      <w:r>
+        <w:rPr>
+          <w:lang w:val="en-GB"/>
+        </w:rPr>
+        <w:t>eferred</w:t>
+      </w:r>
+      <w:r>
+        <w:rPr>
+          <w:lang w:val="en-GB"/>
+        </w:rPr>
+        <w:t xml:space="preserve"> rendering</w:t>
+      </w:r>
+      <w:r>
+        <w:rPr>
+          <w:lang w:val="en-GB"/>
+        </w:rPr>
+        <w:t xml:space="preserve"> was slightly faster than </w:t>
+      </w:r>
+      <w:r>
+        <w:rPr>
+          <w:lang w:val="en-GB"/>
+        </w:rPr>
+        <w:t>forward</w:t>
+      </w:r>
+      <w:r>
+        <w:rPr>
+          <w:lang w:val="en-GB"/>
+        </w:rPr>
+        <w:t>, while draw calls remained nearly identical.</w:t>
+      </w:r>
+    </w:p>
+    <w:p>
+      <w:pPr>
+        <w:rPr>
+          <w:lang w:val="en-GB"/>
+        </w:rPr>
+      </w:pPr>
+      <w:r>
+        <w:rPr>
+          <w:lang w:val="en-GB"/>
+        </w:rPr>
+        <w:t>The cost came from foliage overlap overdraw</w:t>
+      </w:r>
+      <w:r>
+        <w:rPr>
+          <w:lang w:val="en-GB"/>
+        </w:rPr>
+        <w:t>,</w:t>
+      </w:r>
+      <w:r>
+        <w:rPr>
+          <w:lang w:val="en-GB"/>
+        </w:rPr>
+        <w:t xml:space="preserve"> render path changed pass structure more than geometry workload.</w:t>
+      </w:r>
+    </w:p>
+    <w:p>
+      <w:pPr>
+        <w:rPr>
+          <w:lang w:val="en-GB"/>
+        </w:rPr>
+      </w:pPr>
+      <w:r>
+        <w:rPr>
+          <w:lang w:val="en-GB"/>
+        </w:rPr>
+        <w:t>In c</w:t>
+      </w:r>
+      <w:r>
+        <w:rPr>
+          <w:lang w:val="en-GB"/>
+        </w:rPr>
+        <w:t>onclusion for this test, path choice had a modest impact</w:t>
+      </w:r>
+      <w:r>
+        <w:rPr>
+          <w:lang w:val="en-GB"/>
+        </w:rPr>
+        <w:t xml:space="preserve"> while</w:t>
+      </w:r>
+      <w:r>
+        <w:rPr>
+          <w:lang w:val="en-GB"/>
+        </w:rPr>
+        <w:t xml:space="preserve"> foliage representation is likely the stronger optimization lever in Step 3.”</w:t>
+      </w:r>
+    </w:p>
+    <w:p>
+      <w:pPr>
+        <w:pStyle w:val="Heading2"/>
+        <w:rPr>
+          <w:lang w:val="en-GB"/>
+        </w:rPr>
+      </w:pPr>
+      <w:r>
+        <w:rPr>
+          <w:lang w:val="en-GB"/>
+        </w:rPr>
+        <w:t>Record</w:t>
+      </w:r>
+    </w:p>
+    <w:tbl>
+      <w:tblPr>
+        <w:tblStyle w:val="GridTable5Dark-Accent1"/>
+        <w:tblW w:w="0" w:type="auto"/>
+        <w:tblLook w:val="04A0" w:firstRow="1" w:lastRow="0" w:firstColumn="1" w:lastColumn="0" w:noHBand="0" w:noVBand="1"/>
+      </w:tblPr>
+      <w:tblGrid>
+        <w:gridCol w:w="1597"/>
+        <w:gridCol w:w="2975"/>
+        <w:gridCol w:w="2703"/>
+        <w:gridCol w:w="1741"/>
+      </w:tblGrid>
+      <w:tr>
+        <w:trPr>
+          <w:cnfStyle w:val="100000000000" w:firstRow="1" w:lastRow="0" w:firstColumn="0" w:lastColumn="0" w:oddVBand="0" w:evenVBand="0" w:oddHBand="0" w:evenHBand="0" w:firstRowFirstColumn="0" w:firstRowLastColumn="0" w:lastRowFirstColumn="0" w:lastRowLastColumn="0"/>
+        </w:trPr>
+        <w:tc>
+          <w:tcPr>
+            <w:cnfStyle w:val="001000000000" w:firstRow="0" w:lastRow="0" w:firstColumn="1" w:lastColumn="0" w:oddVBand="0" w:evenVBand="0" w:oddHBand="0" w:evenHBand="0" w:firstRowFirstColumn="0" w:firstRowLastColumn="0" w:lastRowFirstColumn="0" w:lastRowLastColumn="0"/>
+            <w:tcW w:w="0" w:type="auto"/>
+            <w:vAlign w:val="center"/>
+          </w:tcPr>
+          <w:p>
+            <w:pPr>
+              <w:jc w:val="center"/>
+            </w:pPr>
+            <w:r>
+              <w:t>Metric</w:t>
+            </w:r>
+          </w:p>
+        </w:tc>
+        <w:tc>
+          <w:tcPr>
+            <w:tcW w:w="0" w:type="auto"/>
+            <w:vAlign w:val="center"/>
+          </w:tcPr>
+          <w:p>
+            <w:pPr>
+              <w:jc w:val="center"/>
+              <w:cnfStyle w:val="100000000000" w:firstRow="1" w:lastRow="0" w:firstColumn="0" w:lastColumn="0" w:oddVBand="0" w:evenVBand="0" w:oddHBand="0" w:evenHBand="0" w:firstRowFirstColumn="0" w:firstRowLastColumn="0" w:lastRowFirstColumn="0" w:lastRowLastColumn="0"/>
+            </w:pPr>
+            <w:r>
+              <w:t>Forward</w:t>
+            </w:r>
+          </w:p>
+        </w:tc>
+        <w:tc>
+          <w:tcPr>
+            <w:tcW w:w="0" w:type="auto"/>
+            <w:vAlign w:val="center"/>
+          </w:tcPr>
+          <w:p>
+            <w:pPr>
+              <w:jc w:val="center"/>
+              <w:cnfStyle w:val="100000000000" w:firstRow="1" w:lastRow="0" w:firstColumn="0" w:lastColumn="0" w:oddVBand="0" w:evenVBand="0" w:oddHBand="0" w:evenHBand="0" w:firstRowFirstColumn="0" w:firstRowLastColumn="0" w:lastRowFirstColumn="0" w:lastRowLastColumn="0"/>
+            </w:pPr>
+            <w:r>
+              <w:t>Deferred</w:t>
+            </w:r>
+          </w:p>
+        </w:tc>
+        <w:tc>
+          <w:tcPr>
+            <w:tcW w:w="0" w:type="auto"/>
+            <w:vAlign w:val="center"/>
+          </w:tcPr>
+          <w:p>
+            <w:pPr>
+              <w:jc w:val="center"/>
+              <w:cnfStyle w:val="100000000000" w:firstRow="1" w:lastRow="0" w:firstColumn="0" w:lastColumn="0" w:oddVBand="0" w:evenVBand="0" w:oddHBand="0" w:evenHBand="0" w:firstRowFirstColumn="0" w:firstRowLastColumn="0" w:lastRowFirstColumn="0" w:lastRowLastColumn="0"/>
+            </w:pPr>
+            <w:r>
+              <w:t>Notes</w:t>
+            </w:r>
+          </w:p>
+        </w:tc>
+      </w:tr>
+      <w:tr>
+        <w:trPr>
+          <w:cnfStyle w:val="000000100000" w:firstRow="0" w:lastRow="0" w:firstColumn="0" w:lastColumn="0" w:oddVBand="0" w:evenVBand="0" w:oddHBand="1" w:evenHBand="0" w:firstRowFirstColumn="0" w:firstRowLastColumn="0" w:lastRowFirstColumn="0" w:lastRowLastColumn="0"/>
+        </w:trPr>
+        <w:tc>
+          <w:tcPr>
+            <w:cnfStyle w:val="001000000000" w:firstRow="0" w:lastRow="0" w:firstColumn="1" w:lastColumn="0" w:oddVBand="0" w:evenVBand="0" w:oddHBand="0" w:evenHBand="0" w:firstRowFirstColumn="0" w:firstRowLastColumn="0" w:lastRowFirstColumn="0" w:lastRowLastColumn="0"/>
+            <w:tcW w:w="0" w:type="auto"/>
+            <w:vAlign w:val="center"/>
+          </w:tcPr>
+          <w:p>
+            <w:pPr>
+              <w:jc w:val="center"/>
+            </w:pPr>
+            <w:r>
+              <w:t>GPU Frame Time (</w:t>
+            </w:r>
+            <w:proofErr w:type="spellStart"/>
+            <w:r>
+              <w:t>ms</w:t>
+            </w:r>
+            <w:proofErr w:type="spellEnd"/>
+            <w:r>
+              <w:t>)</w:t>
+            </w:r>
+          </w:p>
+        </w:tc>
+        <w:tc>
+          <w:tcPr>
+            <w:tcW w:w="0" w:type="auto"/>
+            <w:vAlign w:val="center"/>
+          </w:tcPr>
+          <w:p>
+            <w:pPr>
+              <w:jc w:val="center"/>
+              <w:cnfStyle w:val="000000100000" w:firstRow="0" w:lastRow="0" w:firstColumn="0" w:lastColumn="0" w:oddVBand="0" w:evenVBand="0" w:oddHBand="1" w:evenHBand="0" w:firstRowFirstColumn="0" w:firstRowLastColumn="0" w:lastRowFirstColumn="0" w:lastRowLastColumn="0"/>
+            </w:pPr>
+            <w:r>
+              <w:t xml:space="preserve">3.10 </w:t>
+            </w:r>
+            <w:proofErr w:type="spellStart"/>
+            <w:r>
+              <w:t>ms</w:t>
+            </w:r>
+            <w:proofErr w:type="spellEnd"/>
+          </w:p>
+        </w:tc>
+        <w:tc>
+          <w:tcPr>
+            <w:tcW w:w="0" w:type="auto"/>
+            <w:vAlign w:val="center"/>
+          </w:tcPr>
+          <w:p>
+            <w:pPr>
+              <w:jc w:val="center"/>
+              <w:cnfStyle w:val="000000100000" w:firstRow="0" w:lastRow="0" w:firstColumn="0" w:lastColumn="0" w:oddVBand="0" w:evenVBand="0" w:oddHBand="1" w:evenHBand="0" w:firstRowFirstColumn="0" w:firstRowLastColumn="0" w:lastRowFirstColumn="0" w:lastRowLastColumn="0"/>
+            </w:pPr>
+            <w:r>
+              <w:t xml:space="preserve">2.64 </w:t>
+            </w:r>
+            <w:proofErr w:type="spellStart"/>
+            <w:r>
+              <w:t>ms</w:t>
+            </w:r>
+            <w:proofErr w:type="spellEnd"/>
+          </w:p>
+        </w:tc>
+        <w:tc>
+          <w:tcPr>
+            <w:tcW w:w="0" w:type="auto"/>
+            <w:vAlign w:val="center"/>
+          </w:tcPr>
+          <w:p>
+            <w:pPr>
+              <w:jc w:val="center"/>
+              <w:cnfStyle w:val="000000100000" w:firstRow="0" w:lastRow="0" w:firstColumn="0" w:lastColumn="0" w:oddVBand="0" w:evenVBand="0" w:oddHBand="1" w:evenHBand="0" w:firstRowFirstColumn="0" w:firstRowLastColumn="0" w:lastRowFirstColumn="0" w:lastRowLastColumn="0"/>
+            </w:pPr>
+            <w:r>
+              <w:t>Deferred faster by </w:t>
+            </w:r>
+            <w:r>
+              <w:t xml:space="preserve">0.46 </w:t>
+            </w:r>
+            <w:proofErr w:type="spellStart"/>
+            <w:r>
+              <w:t>ms</w:t>
+            </w:r>
+            <w:proofErr w:type="spellEnd"/>
+            <w:r>
+              <w:t xml:space="preserve"> (</w:t>
+            </w:r>
+            <w:r>
+              <w:t>14.8%)</w:t>
+            </w:r>
+          </w:p>
+        </w:tc>
+      </w:tr>
+      <w:tr>
+        <w:tc>
+          <w:tcPr>
+            <w:cnfStyle w:val="001000000000" w:firstRow="0" w:lastRow="0" w:firstColumn="1" w:lastColumn="0" w:oddVBand="0" w:evenVBand="0" w:oddHBand="0" w:evenHBand="0" w:firstRowFirstColumn="0" w:firstRowLastColumn="0" w:lastRowFirstColumn="0" w:lastRowLastColumn="0"/>
+            <w:tcW w:w="0" w:type="auto"/>
+            <w:vAlign w:val="center"/>
+          </w:tcPr>
+          <w:p>
+            <w:pPr>
+              <w:jc w:val="center"/>
+            </w:pPr>
+            <w:r>
+              <w:t>CPU Frame Time (</w:t>
+            </w:r>
+            <w:proofErr w:type="spellStart"/>
+            <w:r>
+              <w:t>ms</w:t>
+            </w:r>
+            <w:proofErr w:type="spellEnd"/>
+            <w:r>
+              <w:t>)</w:t>
+            </w:r>
+          </w:p>
+        </w:tc>
+        <w:tc>
+          <w:tcPr>
+            <w:tcW w:w="0" w:type="auto"/>
+            <w:vAlign w:val="center"/>
+          </w:tcPr>
+          <w:p>
+            <w:pPr>
+              <w:jc w:val="center"/>
+              <w:cnfStyle w:val="000000000000" w:firstRow="0" w:lastRow="0" w:firstColumn="0" w:lastColumn="0" w:oddVBand="0" w:evenVBand="0" w:oddHBand="0" w:evenHBand="0" w:firstRowFirstColumn="0" w:firstRowLastColumn="0" w:lastRowFirstColumn="0" w:lastRowLastColumn="0"/>
+            </w:pPr>
+            <w:r>
+              <w:t xml:space="preserve">4.28 </w:t>
+            </w:r>
+            <w:proofErr w:type="spellStart"/>
+            <w:r>
+              <w:t>ms</w:t>
+            </w:r>
+            <w:proofErr w:type="spellEnd"/>
+          </w:p>
+        </w:tc>
+        <w:tc>
+          <w:tcPr>
+            <w:tcW w:w="0" w:type="auto"/>
+            <w:vAlign w:val="center"/>
+          </w:tcPr>
+          <w:p>
+            <w:pPr>
+              <w:jc w:val="center"/>
+              <w:cnfStyle w:val="000000000000" w:firstRow="0" w:lastRow="0" w:firstColumn="0" w:lastColumn="0" w:oddVBand="0" w:evenVBand="0" w:oddHBand="0" w:evenHBand="0" w:firstRowFirstColumn="0" w:firstRowLastColumn="0" w:lastRowFirstColumn="0" w:lastRowLastColumn="0"/>
+            </w:pPr>
+            <w:r>
+              <w:t xml:space="preserve">4.54 </w:t>
+            </w:r>
+            <w:proofErr w:type="spellStart"/>
+            <w:r>
+              <w:t>ms</w:t>
+            </w:r>
+            <w:proofErr w:type="spellEnd"/>
+          </w:p>
+        </w:tc>
+        <w:tc>
+          <w:tcPr>
+            <w:tcW w:w="0" w:type="auto"/>
+            <w:vAlign w:val="center"/>
+          </w:tcPr>
+          <w:p>
+            <w:pPr>
+              <w:jc w:val="center"/>
+              <w:cnfStyle w:val="000000000000" w:firstRow="0" w:lastRow="0" w:firstColumn="0" w:lastColumn="0" w:oddVBand="0" w:evenVBand="0" w:oddHBand="0" w:evenHBand="0" w:firstRowFirstColumn="0" w:firstRowLastColumn="0" w:lastRowFirstColumn="0" w:lastRowLastColumn="0"/>
+            </w:pPr>
+            <w:r>
+              <w:t>Similar overall</w:t>
+            </w:r>
+            <w:r>
+              <w:t xml:space="preserve"> with </w:t>
+            </w:r>
+            <w:r>
+              <w:t>minor variation</w:t>
+            </w:r>
+          </w:p>
+        </w:tc>
+      </w:tr>
+      <w:tr>
+        <w:trPr>
+          <w:cnfStyle w:val="000000100000" w:firstRow="0" w:lastRow="0" w:firstColumn="0" w:lastColumn="0" w:oddVBand="0" w:evenVBand="0" w:oddHBand="1" w:evenHBand="0" w:firstRowFirstColumn="0" w:firstRowLastColumn="0" w:lastRowFirstColumn="0" w:lastRowLastColumn="0"/>
+        </w:trPr>
+        <w:tc>
+          <w:tcPr>
+            <w:cnfStyle w:val="001000000000" w:firstRow="0" w:lastRow="0" w:firstColumn="1" w:lastColumn="0" w:oddVBand="0" w:evenVBand="0" w:oddHBand="0" w:evenHBand="0" w:firstRowFirstColumn="0" w:firstRowLastColumn="0" w:lastRowFirstColumn="0" w:lastRowLastColumn="0"/>
+            <w:tcW w:w="0" w:type="auto"/>
+            <w:vAlign w:val="center"/>
+          </w:tcPr>
+          <w:p>
+            <w:pPr>
+              <w:jc w:val="center"/>
+            </w:pPr>
+            <w:r>
+              <w:t>Draw Calls</w:t>
+            </w:r>
+          </w:p>
+        </w:tc>
+        <w:tc>
+          <w:tcPr>
+            <w:tcW w:w="0" w:type="auto"/>
+            <w:vAlign w:val="center"/>
+          </w:tcPr>
+          <w:p>
+            <w:pPr>
+              <w:jc w:val="center"/>
+              <w:cnfStyle w:val="000000100000" w:firstRow="0" w:lastRow="0" w:firstColumn="0" w:lastColumn="0" w:oddVBand="0" w:evenVBand="0" w:oddHBand="1" w:evenHBand="0" w:firstRowFirstColumn="0" w:firstRowLastColumn="0" w:lastRowFirstColumn="0" w:lastRowLastColumn="0"/>
+            </w:pPr>
+            <w:r>
+              <w:t>62</w:t>
+            </w:r>
+          </w:p>
+        </w:tc>
+        <w:tc>
+          <w:tcPr>
+            <w:tcW w:w="0" w:type="auto"/>
+            <w:vAlign w:val="center"/>
+          </w:tcPr>
+          <w:p>
+            <w:pPr>
+              <w:jc w:val="center"/>
+              <w:cnfStyle w:val="000000100000" w:firstRow="0" w:lastRow="0" w:firstColumn="0" w:lastColumn="0" w:oddVBand="0" w:evenVBand="0" w:oddHBand="1" w:evenHBand="0" w:firstRowFirstColumn="0" w:firstRowLastColumn="0" w:lastRowFirstColumn="0" w:lastRowLastColumn="0"/>
+            </w:pPr>
+            <w:r>
+              <w:t>63</w:t>
+            </w:r>
+          </w:p>
+        </w:tc>
+        <w:tc>
+          <w:tcPr>
+            <w:tcW w:w="0" w:type="auto"/>
+            <w:vAlign w:val="center"/>
+          </w:tcPr>
+          <w:p>
+            <w:pPr>
+              <w:jc w:val="center"/>
+              <w:cnfStyle w:val="000000100000" w:firstRow="0" w:lastRow="0" w:firstColumn="0" w:lastColumn="0" w:oddVBand="0" w:evenVBand="0" w:oddHBand="1" w:evenHBand="0" w:firstRowFirstColumn="0" w:firstRowLastColumn="0" w:lastRowFirstColumn="0" w:lastRowLastColumn="0"/>
+            </w:pPr>
+            <w:r>
+              <w:t>Equivalent in this setup</w:t>
+            </w:r>
+          </w:p>
+        </w:tc>
+      </w:tr>
+      <w:tr>
+        <w:tc>
+          <w:tcPr>
+            <w:cnfStyle w:val="001000000000" w:firstRow="0" w:lastRow="0" w:firstColumn="1" w:lastColumn="0" w:oddVBand="0" w:evenVBand="0" w:oddHBand="0" w:evenHBand="0" w:firstRowFirstColumn="0" w:firstRowLastColumn="0" w:lastRowFirstColumn="0" w:lastRowLastColumn="0"/>
+            <w:tcW w:w="0" w:type="auto"/>
+            <w:vAlign w:val="center"/>
+          </w:tcPr>
+          <w:p>
+            <w:pPr>
+              <w:jc w:val="center"/>
+            </w:pPr>
+            <w:r>
+              <w:t>Dominant GPU Passes</w:t>
+            </w:r>
+          </w:p>
+        </w:tc>
+        <w:tc>
+          <w:tcPr>
+            <w:tcW w:w="0" w:type="auto"/>
+            <w:vAlign w:val="center"/>
+          </w:tcPr>
+          <w:p>
+            <w:pPr>
+              <w:jc w:val="center"/>
+              <w:cnfStyle w:val="000000000000" w:firstRow="0" w:lastRow="0" w:firstColumn="0" w:lastColumn="0" w:oddVBand="0" w:evenVBand="0" w:oddHBand="0" w:evenHBand="0" w:firstRowFirstColumn="0" w:firstRowLastColumn="0" w:lastRowFirstColumn="0" w:lastRowLastColumn="0"/>
+            </w:pPr>
+            <w:r>
+              <w:t xml:space="preserve">SSAO (1.212), </w:t>
+            </w:r>
+            <w:proofErr w:type="spellStart"/>
+            <w:r>
+              <w:t>DrawOpaqueObjects</w:t>
+            </w:r>
+            <w:proofErr w:type="spellEnd"/>
+            <w:r>
+              <w:t xml:space="preserve"> (0.932), </w:t>
+            </w:r>
+            <w:proofErr w:type="spellStart"/>
+            <w:r>
+              <w:t>RG_UberPost</w:t>
+            </w:r>
+            <w:proofErr w:type="spellEnd"/>
+            <w:r>
+              <w:t xml:space="preserve"> (0.281), Bloom (0.192), </w:t>
+            </w:r>
+            <w:proofErr w:type="spellStart"/>
+            <w:r>
+              <w:t>RG_FinalBlit</w:t>
+            </w:r>
+            <w:proofErr w:type="spellEnd"/>
+            <w:r>
+              <w:t xml:space="preserve"> (0.190), </w:t>
+            </w:r>
+            <w:proofErr w:type="spellStart"/>
+            <w:r>
+              <w:t>DrawDepthNormalPrepass</w:t>
+            </w:r>
+            <w:proofErr w:type="spellEnd"/>
+            <w:r>
+              <w:t xml:space="preserve"> (0.171)</w:t>
+            </w:r>
+          </w:p>
+        </w:tc>
+        <w:tc>
+          <w:tcPr>
+            <w:tcW w:w="0" w:type="auto"/>
+            <w:vAlign w:val="center"/>
+          </w:tcPr>
+          <w:p>
+            <w:pPr>
+              <w:jc w:val="center"/>
+              <w:cnfStyle w:val="000000000000" w:firstRow="0" w:lastRow="0" w:firstColumn="0" w:lastColumn="0" w:oddVBand="0" w:evenVBand="0" w:oddHBand="0" w:evenHBand="0" w:firstRowFirstColumn="0" w:firstRowLastColumn="0" w:lastRowFirstColumn="0" w:lastRowLastColumn="0"/>
+            </w:pPr>
+            <w:r>
+              <w:t xml:space="preserve">SSAO (0.699), </w:t>
+            </w:r>
+            <w:proofErr w:type="spellStart"/>
+            <w:r>
+              <w:t>DrawGBuffer</w:t>
+            </w:r>
+            <w:proofErr w:type="spellEnd"/>
+            <w:r>
+              <w:t xml:space="preserve"> (0.538), </w:t>
+            </w:r>
+            <w:proofErr w:type="spellStart"/>
+            <w:r>
+              <w:t>RenderDeferredLighting</w:t>
+            </w:r>
+            <w:proofErr w:type="spellEnd"/>
+            <w:r>
+              <w:t xml:space="preserve"> (0.386), </w:t>
+            </w:r>
+            <w:proofErr w:type="spellStart"/>
+            <w:r>
+              <w:t>CopyDepth</w:t>
+            </w:r>
+            <w:proofErr w:type="spellEnd"/>
+            <w:r>
+              <w:t xml:space="preserve"> (0.284), </w:t>
+            </w:r>
+            <w:proofErr w:type="spellStart"/>
+            <w:r>
+              <w:t>RG_UberPost</w:t>
+            </w:r>
+            <w:proofErr w:type="spellEnd"/>
+            <w:r>
+              <w:t xml:space="preserve"> (0.260), Bloom (0.183), </w:t>
+            </w:r>
+            <w:proofErr w:type="spellStart"/>
+            <w:r>
+              <w:t>RG_FinalBlit</w:t>
+            </w:r>
+            <w:proofErr w:type="spellEnd"/>
+            <w:r>
+              <w:t xml:space="preserve"> (0.176)</w:t>
+            </w:r>
+          </w:p>
+        </w:tc>
+        <w:tc>
+          <w:tcPr>
+            <w:tcW w:w="0" w:type="auto"/>
+            <w:vAlign w:val="center"/>
+          </w:tcPr>
+          <w:p>
+            <w:pPr>
+              <w:jc w:val="center"/>
+              <w:cnfStyle w:val="000000000000" w:firstRow="0" w:lastRow="0" w:firstColumn="0" w:lastColumn="0" w:oddVBand="0" w:evenVBand="0" w:oddHBand="0" w:evenHBand="0" w:firstRowFirstColumn="0" w:firstRowLastColumn="0" w:lastRowFirstColumn="0" w:lastRowLastColumn="0"/>
+            </w:pPr>
+            <w:r>
+              <w:t>Forward concentrates lighting/object shading in opaque pass</w:t>
+            </w:r>
+            <w:r>
+              <w:t xml:space="preserve">. </w:t>
+            </w:r>
+            <w:r>
+              <w:t xml:space="preserve"> Deferred splits into </w:t>
+            </w:r>
+            <w:proofErr w:type="spellStart"/>
+            <w:r>
+              <w:t>GBuffer</w:t>
+            </w:r>
+            <w:proofErr w:type="spellEnd"/>
+            <w:r>
+              <w:t xml:space="preserve"> + lighting pass</w:t>
+            </w:r>
+            <w:r>
+              <w:t>.</w:t>
+            </w:r>
+          </w:p>
+        </w:tc>
+      </w:tr>
+      <w:tr>
+        <w:trPr>
+          <w:cnfStyle w:val="000000100000" w:firstRow="0" w:lastRow="0" w:firstColumn="0" w:lastColumn="0" w:oddVBand="0" w:evenVBand="0" w:oddHBand="1" w:evenHBand="0" w:firstRowFirstColumn="0" w:firstRowLastColumn="0" w:lastRowFirstColumn="0" w:lastRowLastColumn="0"/>
+        </w:trPr>
+        <w:tc>
+          <w:tcPr>
+            <w:cnfStyle w:val="001000000000" w:firstRow="0" w:lastRow="0" w:firstColumn="1" w:lastColumn="0" w:oddVBand="0" w:evenVBand="0" w:oddHBand="0" w:evenHBand="0" w:firstRowFirstColumn="0" w:firstRowLastColumn="0" w:lastRowFirstColumn="0" w:lastRowLastColumn="0"/>
+            <w:tcW w:w="0" w:type="auto"/>
+            <w:vAlign w:val="center"/>
+          </w:tcPr>
+          <w:p>
+            <w:pPr>
+              <w:jc w:val="center"/>
+            </w:pPr>
+            <w:r>
+              <w:t xml:space="preserve">Frame Debugger </w:t>
+            </w:r>
+            <w:proofErr w:type="spellStart"/>
+            <w:r>
+              <w:lastRenderedPageBreak/>
+              <w:t>RenderGraph</w:t>
+            </w:r>
+            <w:proofErr w:type="spellEnd"/>
+            <w:r>
+              <w:t xml:space="preserve"> Events</w:t>
+            </w:r>
+          </w:p>
+        </w:tc>
+        <w:tc>
+          <w:tcPr>
+            <w:tcW w:w="0" w:type="auto"/>
+            <w:vAlign w:val="center"/>
+          </w:tcPr>
+          <w:p>
+            <w:pPr>
+              <w:jc w:val="center"/>
+              <w:cnfStyle w:val="000000100000" w:firstRow="0" w:lastRow="0" w:firstColumn="0" w:lastColumn="0" w:oddVBand="0" w:evenVBand="0" w:oddHBand="1" w:evenHBand="0" w:firstRowFirstColumn="0" w:firstRowLastColumn="0" w:lastRowFirstColumn="0" w:lastRowLastColumn="0"/>
+            </w:pPr>
+            <w:r>
+              <w:lastRenderedPageBreak/>
+              <w:t>~45</w:t>
+            </w:r>
+          </w:p>
+        </w:tc>
+        <w:tc>
+          <w:tcPr>
+            <w:tcW w:w="0" w:type="auto"/>
+            <w:vAlign w:val="center"/>
+          </w:tcPr>
+          <w:p>
+            <w:pPr>
+              <w:jc w:val="center"/>
+              <w:cnfStyle w:val="000000100000" w:firstRow="0" w:lastRow="0" w:firstColumn="0" w:lastColumn="0" w:oddVBand="0" w:evenVBand="0" w:oddHBand="1" w:evenHBand="0" w:firstRowFirstColumn="0" w:firstRowLastColumn="0" w:lastRowFirstColumn="0" w:lastRowLastColumn="0"/>
+            </w:pPr>
+            <w:r>
+              <w:t>~44</w:t>
+            </w:r>
+          </w:p>
+        </w:tc>
+        <w:tc>
+          <w:tcPr>
+            <w:tcW w:w="0" w:type="auto"/>
+            <w:vAlign w:val="center"/>
+          </w:tcPr>
+          <w:p>
+            <w:pPr>
+              <w:jc w:val="center"/>
+              <w:cnfStyle w:val="000000100000" w:firstRow="0" w:lastRow="0" w:firstColumn="0" w:lastColumn="0" w:oddVBand="0" w:evenVBand="0" w:oddHBand="1" w:evenHBand="0" w:firstRowFirstColumn="0" w:firstRowLastColumn="0" w:lastRowFirstColumn="0" w:lastRowLastColumn="0"/>
+            </w:pPr>
+            <w:r>
+              <w:t>Near-identical complexity</w:t>
+            </w:r>
+          </w:p>
+        </w:tc>
+      </w:tr>
+      <w:tr>
+        <w:tc>
+          <w:tcPr>
+            <w:cnfStyle w:val="001000000000" w:firstRow="0" w:lastRow="0" w:firstColumn="1" w:lastColumn="0" w:oddVBand="0" w:evenVBand="0" w:oddHBand="0" w:evenHBand="0" w:firstRowFirstColumn="0" w:firstRowLastColumn="0" w:lastRowFirstColumn="0" w:lastRowLastColumn="0"/>
+            <w:tcW w:w="0" w:type="auto"/>
+            <w:vAlign w:val="center"/>
+          </w:tcPr>
+          <w:p>
+            <w:pPr>
+              <w:jc w:val="center"/>
+            </w:pPr>
+            <w:r>
+              <w:lastRenderedPageBreak/>
+              <w:t>Overdraw (All mode)</w:t>
+            </w:r>
+          </w:p>
+        </w:tc>
+        <w:tc>
+          <w:tcPr>
+            <w:tcW w:w="0" w:type="auto"/>
+            <w:vAlign w:val="center"/>
+          </w:tcPr>
+          <w:p>
+            <w:pPr>
+              <w:jc w:val="center"/>
+              <w:cnfStyle w:val="000000000000" w:firstRow="0" w:lastRow="0" w:firstColumn="0" w:lastColumn="0" w:oddVBand="0" w:evenVBand="0" w:oddHBand="0" w:evenHBand="0" w:firstRowFirstColumn="0" w:firstRowLastColumn="0" w:lastRowFirstColumn="0" w:lastRowLastColumn="0"/>
+            </w:pPr>
+            <w:r>
+              <w:t xml:space="preserve">High overlap at foliage </w:t>
+            </w:r>
+            <w:proofErr w:type="spellStart"/>
+            <w:r>
+              <w:t>center</w:t>
+            </w:r>
+            <w:proofErr w:type="spellEnd"/>
+            <w:r>
+              <w:t xml:space="preserve"> (yellow/red hotspots), blue background</w:t>
+            </w:r>
+          </w:p>
+        </w:tc>
+        <w:tc>
+          <w:tcPr>
+            <w:tcW w:w="0" w:type="auto"/>
+            <w:vAlign w:val="center"/>
+          </w:tcPr>
+          <w:p>
+            <w:pPr>
+              <w:jc w:val="center"/>
+              <w:cnfStyle w:val="000000000000" w:firstRow="0" w:lastRow="0" w:firstColumn="0" w:lastColumn="0" w:oddVBand="0" w:evenVBand="0" w:oddHBand="0" w:evenHBand="0" w:firstRowFirstColumn="0" w:firstRowLastColumn="0" w:lastRowFirstColumn="0" w:lastRowLastColumn="0"/>
+            </w:pPr>
+            <w:r>
+              <w:t>Similar foliage hotspot pattern</w:t>
+            </w:r>
+          </w:p>
+        </w:tc>
+        <w:tc>
+          <w:tcPr>
+            <w:tcW w:w="0" w:type="auto"/>
+            <w:vAlign w:val="center"/>
+          </w:tcPr>
+          <w:p>
+            <w:pPr>
+              <w:jc w:val="center"/>
+              <w:cnfStyle w:val="000000000000" w:firstRow="0" w:lastRow="0" w:firstColumn="0" w:lastColumn="0" w:oddVBand="0" w:evenVBand="0" w:oddHBand="0" w:evenHBand="0" w:firstRowFirstColumn="0" w:firstRowLastColumn="0" w:lastRowFirstColumn="0" w:lastRowLastColumn="0"/>
+            </w:pPr>
+            <w:r>
+              <w:t>Overdraw source is foliage overlap, not render-path change</w:t>
+            </w:r>
+          </w:p>
+        </w:tc>
+      </w:tr>
+      <w:tr>
+        <w:trPr>
+          <w:cnfStyle w:val="000000100000" w:firstRow="0" w:lastRow="0" w:firstColumn="0" w:lastColumn="0" w:oddVBand="0" w:evenVBand="0" w:oddHBand="1" w:evenHBand="0" w:firstRowFirstColumn="0" w:firstRowLastColumn="0" w:lastRowFirstColumn="0" w:lastRowLastColumn="0"/>
+        </w:trPr>
+        <w:tc>
+          <w:tcPr>
+            <w:cnfStyle w:val="001000000000" w:firstRow="0" w:lastRow="0" w:firstColumn="1" w:lastColumn="0" w:oddVBand="0" w:evenVBand="0" w:oddHBand="0" w:evenHBand="0" w:firstRowFirstColumn="0" w:firstRowLastColumn="0" w:lastRowFirstColumn="0" w:lastRowLastColumn="0"/>
+            <w:tcW w:w="0" w:type="auto"/>
+            <w:vAlign w:val="center"/>
+          </w:tcPr>
+          <w:p>
+            <w:pPr>
+              <w:jc w:val="center"/>
+            </w:pPr>
+            <w:r>
+              <w:t>Visual Result</w:t>
+            </w:r>
+          </w:p>
+        </w:tc>
+        <w:tc>
+          <w:tcPr>
+            <w:tcW w:w="0" w:type="auto"/>
+            <w:vAlign w:val="center"/>
+          </w:tcPr>
+          <w:p>
+            <w:pPr>
+              <w:jc w:val="center"/>
+              <w:cnfStyle w:val="000000100000" w:firstRow="0" w:lastRow="0" w:firstColumn="0" w:lastColumn="0" w:oddVBand="0" w:evenVBand="0" w:oddHBand="1" w:evenHBand="0" w:firstRowFirstColumn="0" w:firstRowLastColumn="0" w:lastRowFirstColumn="0" w:lastRowLastColumn="0"/>
+            </w:pPr>
+            <w:r>
+              <w:t>Comparable look</w:t>
+            </w:r>
+          </w:p>
+        </w:tc>
+        <w:tc>
+          <w:tcPr>
+            <w:tcW w:w="0" w:type="auto"/>
+            <w:vAlign w:val="center"/>
+          </w:tcPr>
+          <w:p>
+            <w:pPr>
+              <w:jc w:val="center"/>
+              <w:cnfStyle w:val="000000100000" w:firstRow="0" w:lastRow="0" w:firstColumn="0" w:lastColumn="0" w:oddVBand="0" w:evenVBand="0" w:oddHBand="1" w:evenHBand="0" w:firstRowFirstColumn="0" w:firstRowLastColumn="0" w:lastRowFirstColumn="0" w:lastRowLastColumn="0"/>
+            </w:pPr>
+            <w:r>
+              <w:t>Slight perceived detail difference</w:t>
+            </w:r>
+          </w:p>
+        </w:tc>
+        <w:tc>
+          <w:tcPr>
+            <w:tcW w:w="0" w:type="auto"/>
+            <w:vAlign w:val="center"/>
+          </w:tcPr>
+          <w:p>
+            <w:pPr>
+              <w:jc w:val="center"/>
+              <w:cnfStyle w:val="000000100000" w:firstRow="0" w:lastRow="0" w:firstColumn="0" w:lastColumn="0" w:oddVBand="0" w:evenVBand="0" w:oddHBand="1" w:evenHBand="0" w:firstRowFirstColumn="0" w:firstRowLastColumn="0" w:lastRowFirstColumn="0" w:lastRowLastColumn="0"/>
+            </w:pPr>
+            <w:r>
+              <w:t>Likely AA/path/post differences; not major correctness issue</w:t>
+            </w:r>
+          </w:p>
+        </w:tc>
+      </w:tr>
+    </w:tbl>
+    <w:p>
+      <w:pPr>
+        <w:pStyle w:val="Heading1"/>
+        <w:rPr>
+          <w:lang w:val="en-GB"/>
+        </w:rPr>
+      </w:pPr>
+      <w:r>
+        <w:rPr>
+          <w:lang w:val="en-GB"/>
+        </w:rPr>
+        <w:t>Foliage</w:t>
+      </w:r>
+    </w:p>
+    <w:p>
+      <w:pPr>
+        <w:pStyle w:val="Subtitle"/>
+        <w:rPr>
+          <w:rStyle w:val="SubtleEmphasis"/>
+        </w:rPr>
+      </w:pPr>
+      <w:r>
+        <w:rPr>
+          <w:rStyle w:val="SubtleEmphasis"/>
+        </w:rPr>
+        <w:t>Dense micro-triangles</w:t>
+      </w:r>
+    </w:p>
+    <w:p>
+      <w:pPr>
+        <w:rPr>
+          <w:lang w:val="en-GB"/>
+        </w:rPr>
+      </w:pPr>
+      <w:r>
+        <w:rPr>
+          <w:noProof/>
+          <w:lang w:val="en-GB"/>
+        </w:rPr>
+        <w:drawing>
+          <wp:inline distT="0" distB="0" distL="0" distR="0" wp14:anchorId="0363ED52" wp14:editId="6C5E7745">
+            <wp:extent cx="5731510" cy="2009140"/>
+            <wp:effectExtent l="0" t="0" r="2540" b="0"/>
+            <wp:docPr id="2048584748" name="Picture 1"/>
+            <wp:cNvGraphicFramePr>
+              <a:graphicFrameLocks xmlns:a="http://schemas.openxmlformats.org/drawingml/2006/main" noChangeAspect="1"/>
+            </wp:cNvGraphicFramePr>
+            <a:graphic xmlns:a="http://schemas.openxmlformats.org/drawingml/2006/main">
+              <a:graphicData uri="http://schemas.openxmlformats.org/drawingml/2006/picture">
+                <pic:pic xmlns:pic="http://schemas.openxmlformats.org/drawingml/2006/picture">
+                  <pic:nvPicPr>
+                    <pic:cNvPr id="2048584748" name=""/>
+                    <pic:cNvPicPr/>
+                  </pic:nvPicPr>
+                  <pic:blipFill>
+                    <a:blip r:embed="rId16"/>
+                    <a:stretch>
+                      <a:fillRect/>
+                    </a:stretch>
+                  </pic:blipFill>
+                  <pic:spPr>
+                    <a:xfrm>
+                      <a:off x="0" y="0"/>
+                      <a:ext cx="5731510" cy="2009140"/>
+                    </a:xfrm>
+                    <a:prstGeom prst="rect">
+                      <a:avLst/>
+                    </a:prstGeom>
+                  </pic:spPr>
+                </pic:pic>
+              </a:graphicData>
+            </a:graphic>
+          </wp:inline>
+        </w:drawing>
+      </w:r>
+    </w:p>
+    <w:p>
+      <w:pPr>
+        <w:rPr>
+          <w:lang w:val="en-GB"/>
+        </w:rPr>
+      </w:pPr>
+      <w:r>
+        <w:rPr>
+          <w:noProof/>
+          <w:lang w:val="en-GB"/>
+        </w:rPr>
+        <w:drawing>
+          <wp:inline distT="0" distB="0" distL="0" distR="0" wp14:anchorId="777FED15" wp14:editId="01B735B2">
+            <wp:extent cx="3486329" cy="2578233"/>
+            <wp:effectExtent l="0" t="0" r="0" b="0"/>
+            <wp:docPr id="336539705" name="Picture 1"/>
+            <wp:cNvGraphicFramePr>
+              <a:graphicFrameLocks xmlns:a="http://schemas.openxmlformats.org/drawingml/2006/main" noChangeAspect="1"/>
+            </wp:cNvGraphicFramePr>
+            <a:graphic xmlns:a="http://schemas.openxmlformats.org/drawingml/2006/main">
+              <a:graphicData uri="http://schemas.openxmlformats.org/drawingml/2006/picture">
+                <pic:pic xmlns:pic="http://schemas.openxmlformats.org/drawingml/2006/picture">
+                  <pic:nvPicPr>
+                    <pic:cNvPr id="336539705" name=""/>
+                    <pic:cNvPicPr/>
+                  </pic:nvPicPr>
+                  <pic:blipFill>
+                    <a:blip r:embed="rId17"/>
+                    <a:stretch>
+                      <a:fillRect/>
+                    </a:stretch>
+                  </pic:blipFill>
+                  <pic:spPr>
+                    <a:xfrm>
+                      <a:off x="0" y="0"/>
+                      <a:ext cx="3486329" cy="2578233"/>
+                    </a:xfrm>
+                    <a:prstGeom prst="rect">
+                      <a:avLst/>
+                    </a:prstGeom>
+                  </pic:spPr>
+                </pic:pic>
+              </a:graphicData>
+            </a:graphic>
+          </wp:inline>
+        </w:drawing>
+      </w:r>
+    </w:p>
+    <w:p>
+      <w:pPr>
+        <w:pStyle w:val="Subtitle"/>
+        <w:rPr>
+          <w:rStyle w:val="SubtleEmphasis"/>
+        </w:rPr>
+      </w:pPr>
+      <w:r>
+        <w:rPr>
+          <w:rStyle w:val="SubtleEmphasis"/>
+        </w:rPr>
+        <w:t>LOD-simplified</w:t>
+      </w:r>
+    </w:p>
+    <w:p>
+      <w:r>
+        <w:rPr>
+          <w:noProof/>
+        </w:rPr>
+        <w:lastRenderedPageBreak/>
+        <w:drawing>
+          <wp:inline distT="0" distB="0" distL="0" distR="0" wp14:anchorId="6647AEFA" wp14:editId="67109C89">
+            <wp:extent cx="5245370" cy="1333569"/>
+            <wp:effectExtent l="0" t="0" r="0" b="0"/>
+            <wp:docPr id="269482978" name="Picture 1"/>
+            <wp:cNvGraphicFramePr>
+              <a:graphicFrameLocks xmlns:a="http://schemas.openxmlformats.org/drawingml/2006/main" noChangeAspect="1"/>
+            </wp:cNvGraphicFramePr>
+            <a:graphic xmlns:a="http://schemas.openxmlformats.org/drawingml/2006/main">
+              <a:graphicData uri="http://schemas.openxmlformats.org/drawingml/2006/picture">
+                <pic:pic xmlns:pic="http://schemas.openxmlformats.org/drawingml/2006/picture">
+                  <pic:nvPicPr>
+                    <pic:cNvPr id="269482978" name=""/>
+                    <pic:cNvPicPr/>
+                  </pic:nvPicPr>
+                  <pic:blipFill>
+                    <a:blip r:embed="rId18"/>
+                    <a:stretch>
+                      <a:fillRect/>
+                    </a:stretch>
+                  </pic:blipFill>
+                  <pic:spPr>
+                    <a:xfrm>
+                      <a:off x="0" y="0"/>
+                      <a:ext cx="5245370" cy="1333569"/>
+                    </a:xfrm>
+                    <a:prstGeom prst="rect">
+                      <a:avLst/>
+                    </a:prstGeom>
+                  </pic:spPr>
+                </pic:pic>
+              </a:graphicData>
+            </a:graphic>
+          </wp:inline>
+        </w:drawing>
+      </w:r>
+    </w:p>
+    <w:p>
+      <w:r>
+        <w:rPr>
+          <w:noProof/>
+        </w:rPr>
+        <w:drawing>
+          <wp:inline distT="0" distB="0" distL="0" distR="0" wp14:anchorId="10AD69D5" wp14:editId="6E6B66AB">
+            <wp:extent cx="5731510" cy="2837180"/>
+            <wp:effectExtent l="0" t="0" r="2540" b="1270"/>
+            <wp:docPr id="2079207377" name="Picture 1"/>
+            <wp:cNvGraphicFramePr>
+              <a:graphicFrameLocks xmlns:a="http://schemas.openxmlformats.org/drawingml/2006/main" noChangeAspect="1"/>
+            </wp:cNvGraphicFramePr>
+            <a:graphic xmlns:a="http://schemas.openxmlformats.org/drawingml/2006/main">
+              <a:graphicData uri="http://schemas.openxmlformats.org/drawingml/2006/picture">
+                <pic:pic xmlns:pic="http://schemas.openxmlformats.org/drawingml/2006/picture">
+                  <pic:nvPicPr>
+                    <pic:cNvPr id="2079207377" name=""/>
+                    <pic:cNvPicPr/>
+                  </pic:nvPicPr>
+                  <pic:blipFill>
+                    <a:blip r:embed="rId19"/>
+                    <a:stretch>
+                      <a:fillRect/>
+                    </a:stretch>
+                  </pic:blipFill>
+                  <pic:spPr>
+                    <a:xfrm>
+                      <a:off x="0" y="0"/>
+                      <a:ext cx="5731510" cy="2837180"/>
+                    </a:xfrm>
+                    <a:prstGeom prst="rect">
+                      <a:avLst/>
+                    </a:prstGeom>
+                  </pic:spPr>
+                </pic:pic>
+              </a:graphicData>
+            </a:graphic>
+          </wp:inline>
+        </w:drawing>
+      </w:r>
+    </w:p>
+    <w:p>
+      <w:r>
+        <w:rPr>
+          <w:noProof/>
+        </w:rPr>
+        <w:drawing>
+          <wp:inline distT="0" distB="0" distL="0" distR="0" wp14:anchorId="72748C9F" wp14:editId="7FC57F09">
+            <wp:extent cx="5731510" cy="2147570"/>
+            <wp:effectExtent l="0" t="0" r="2540" b="5080"/>
+            <wp:docPr id="397711144" name="Picture 1"/>
+            <wp:cNvGraphicFramePr>
+              <a:graphicFrameLocks xmlns:a="http://schemas.openxmlformats.org/drawingml/2006/main" noChangeAspect="1"/>
+            </wp:cNvGraphicFramePr>
+            <a:graphic xmlns:a="http://schemas.openxmlformats.org/drawingml/2006/main">
+              <a:graphicData uri="http://schemas.openxmlformats.org/drawingml/2006/picture">
+                <pic:pic xmlns:pic="http://schemas.openxmlformats.org/drawingml/2006/picture">
+                  <pic:nvPicPr>
+                    <pic:cNvPr id="397711144" name=""/>
+                    <pic:cNvPicPr/>
+                  </pic:nvPicPr>
+                  <pic:blipFill>
+                    <a:blip r:embed="rId20"/>
+                    <a:stretch>
+                      <a:fillRect/>
+                    </a:stretch>
+                  </pic:blipFill>
+                  <pic:spPr>
+                    <a:xfrm>
+                      <a:off x="0" y="0"/>
+                      <a:ext cx="5731510" cy="2147570"/>
+                    </a:xfrm>
+                    <a:prstGeom prst="rect">
+                      <a:avLst/>
+                    </a:prstGeom>
+                  </pic:spPr>
+                </pic:pic>
+              </a:graphicData>
+            </a:graphic>
+          </wp:inline>
+        </w:drawing>
+      </w:r>
+    </w:p>
+    <w:p>
+      <w:r>
+        <w:rPr>
+          <w:noProof/>
+        </w:rPr>
+        <w:drawing>
+          <wp:inline distT="0" distB="0" distL="0" distR="0" wp14:anchorId="5C6AAC0A" wp14:editId="56C97B8F">
+            <wp:extent cx="5731510" cy="2003425"/>
+            <wp:effectExtent l="0" t="0" r="2540" b="0"/>
+            <wp:docPr id="2020276925" name="Picture 1"/>
+            <wp:cNvGraphicFramePr>
+              <a:graphicFrameLocks xmlns:a="http://schemas.openxmlformats.org/drawingml/2006/main" noChangeAspect="1"/>
+            </wp:cNvGraphicFramePr>
+            <a:graphic xmlns:a="http://schemas.openxmlformats.org/drawingml/2006/main">
+              <a:graphicData uri="http://schemas.openxmlformats.org/drawingml/2006/picture">
+                <pic:pic xmlns:pic="http://schemas.openxmlformats.org/drawingml/2006/picture">
+                  <pic:nvPicPr>
+                    <pic:cNvPr id="2020276925" name=""/>
+                    <pic:cNvPicPr/>
+                  </pic:nvPicPr>
+                  <pic:blipFill>
+                    <a:blip r:embed="rId21"/>
+                    <a:stretch>
+                      <a:fillRect/>
+                    </a:stretch>
+                  </pic:blipFill>
+                  <pic:spPr>
+                    <a:xfrm>
+                      <a:off x="0" y="0"/>
+                      <a:ext cx="5731510" cy="2003425"/>
+                    </a:xfrm>
+                    <a:prstGeom prst="rect">
+                      <a:avLst/>
+                    </a:prstGeom>
+                  </pic:spPr>
+                </pic:pic>
+              </a:graphicData>
+            </a:graphic>
+          </wp:inline>
+        </w:drawing>
+      </w:r>
+    </w:p>
+    <w:p>
+      <w:r>
+        <w:rPr>
+          <w:noProof/>
+        </w:rPr>
+        <w:lastRenderedPageBreak/>
+        <w:drawing>
+          <wp:inline distT="0" distB="0" distL="0" distR="0" wp14:anchorId="2192E6CE" wp14:editId="1B80B064">
+            <wp:extent cx="5731510" cy="2479040"/>
+            <wp:effectExtent l="0" t="0" r="2540" b="0"/>
+            <wp:docPr id="1104998086" name="Picture 1"/>
+            <wp:cNvGraphicFramePr>
+              <a:graphicFrameLocks xmlns:a="http://schemas.openxmlformats.org/drawingml/2006/main" noChangeAspect="1"/>
+            </wp:cNvGraphicFramePr>
+            <a:graphic xmlns:a="http://schemas.openxmlformats.org/drawingml/2006/main">
+              <a:graphicData uri="http://schemas.openxmlformats.org/drawingml/2006/picture">
+                <pic:pic xmlns:pic="http://schemas.openxmlformats.org/drawingml/2006/picture">
+                  <pic:nvPicPr>
+                    <pic:cNvPr id="1104998086" name=""/>
+                    <pic:cNvPicPr/>
+                  </pic:nvPicPr>
+                  <pic:blipFill>
+                    <a:blip r:embed="rId22"/>
+                    <a:stretch>
+                      <a:fillRect/>
+                    </a:stretch>
+                  </pic:blipFill>
+                  <pic:spPr>
+                    <a:xfrm>
+                      <a:off x="0" y="0"/>
+                      <a:ext cx="5731510" cy="2479040"/>
+                    </a:xfrm>
+                    <a:prstGeom prst="rect">
+                      <a:avLst/>
+                    </a:prstGeom>
+                  </pic:spPr>
+                </pic:pic>
+              </a:graphicData>
+            </a:graphic>
+          </wp:inline>
+        </w:drawing>
+      </w:r>
+    </w:p>
+    <w:p>
+      <w:r>
+        <w:rPr>
+          <w:noProof/>
+        </w:rPr>
+        <w:drawing>
+          <wp:inline distT="0" distB="0" distL="0" distR="0" wp14:anchorId="3C365154" wp14:editId="467FF8FB">
+            <wp:extent cx="5731510" cy="1898015"/>
+            <wp:effectExtent l="0" t="0" r="2540" b="6985"/>
+            <wp:docPr id="1403706892" name="Picture 1"/>
+            <wp:cNvGraphicFramePr>
+              <a:graphicFrameLocks xmlns:a="http://schemas.openxmlformats.org/drawingml/2006/main" noChangeAspect="1"/>
+            </wp:cNvGraphicFramePr>
+            <a:graphic xmlns:a="http://schemas.openxmlformats.org/drawingml/2006/main">
+              <a:graphicData uri="http://schemas.openxmlformats.org/drawingml/2006/picture">
+                <pic:pic xmlns:pic="http://schemas.openxmlformats.org/drawingml/2006/picture">
+                  <pic:nvPicPr>
+                    <pic:cNvPr id="1403706892" name=""/>
+                    <pic:cNvPicPr/>
+                  </pic:nvPicPr>
+                  <pic:blipFill>
+                    <a:blip r:embed="rId23"/>
+                    <a:stretch>
+                      <a:fillRect/>
+                    </a:stretch>
+                  </pic:blipFill>
+                  <pic:spPr>
+                    <a:xfrm>
+                      <a:off x="0" y="0"/>
+                      <a:ext cx="5731510" cy="1898015"/>
+                    </a:xfrm>
+                    <a:prstGeom prst="rect">
+                      <a:avLst/>
+                    </a:prstGeom>
+                  </pic:spPr>
+                </pic:pic>
+              </a:graphicData>
+            </a:graphic>
+          </wp:inline>
+        </w:drawing>
+      </w:r>
+    </w:p>
+    <w:p>
+      <w:pPr>
+        <w:rPr>
+          <w:noProof/>
+        </w:rPr>
+      </w:pPr>
+      <w:r>
+        <w:rPr>
+          <w:noProof/>
+        </w:rPr>
+        <w:t xml:space="preserve"> </w:t>
+      </w:r>
+      <w:r>
+        <w:rPr>
+          <w:noProof/>
+        </w:rPr>
+        <w:drawing>
+          <wp:inline distT="0" distB="0" distL="0" distR="0" wp14:anchorId="1A1A0030" wp14:editId="7285F2B3">
+            <wp:extent cx="1873346" cy="2349621"/>
+            <wp:effectExtent l="0" t="0" r="0" b="0"/>
+            <wp:docPr id="234616687" name="Picture 1"/>
+            <wp:cNvGraphicFramePr>
+              <a:graphicFrameLocks xmlns:a="http://schemas.openxmlformats.org/drawingml/2006/main" noChangeAspect="1"/>
+            </wp:cNvGraphicFramePr>
+            <a:graphic xmlns:a="http://schemas.openxmlformats.org/drawingml/2006/main">
+              <a:graphicData uri="http://schemas.openxmlformats.org/drawingml/2006/picture">
+                <pic:pic xmlns:pic="http://schemas.openxmlformats.org/drawingml/2006/picture">
+                  <pic:nvPicPr>
+                    <pic:cNvPr id="234616687" name=""/>
+                    <pic:cNvPicPr/>
+                  </pic:nvPicPr>
+                  <pic:blipFill>
+                    <a:blip r:embed="rId24"/>
+                    <a:stretch>
+                      <a:fillRect/>
+                    </a:stretch>
+                  </pic:blipFill>
+                  <pic:spPr>
+                    <a:xfrm>
+                      <a:off x="0" y="0"/>
+                      <a:ext cx="1873346" cy="2349621"/>
+                    </a:xfrm>
+                    <a:prstGeom prst="rect">
+                      <a:avLst/>
+                    </a:prstGeom>
+                  </pic:spPr>
+                </pic:pic>
+              </a:graphicData>
+            </a:graphic>
+          </wp:inline>
+        </w:drawing>
+      </w:r>
+      <w:r>
+        <w:rPr>
+          <w:noProof/>
+        </w:rPr>
+        <w:t xml:space="preserve"> </w:t>
+      </w:r>
+      <w:r>
+        <w:rPr>
+          <w:noProof/>
+        </w:rPr>
+        <w:drawing>
+          <wp:inline distT="0" distB="0" distL="0" distR="0" wp14:anchorId="51ADD6B2" wp14:editId="275BE3A4">
+            <wp:extent cx="1982815" cy="2349500"/>
+            <wp:effectExtent l="0" t="0" r="0" b="0"/>
+            <wp:docPr id="218012701" name="Picture 1"/>
+            <wp:cNvGraphicFramePr>
+              <a:graphicFrameLocks xmlns:a="http://schemas.openxmlformats.org/drawingml/2006/main" noChangeAspect="1"/>
+            </wp:cNvGraphicFramePr>
+            <a:graphic xmlns:a="http://schemas.openxmlformats.org/drawingml/2006/main">
+              <a:graphicData uri="http://schemas.openxmlformats.org/drawingml/2006/picture">
+                <pic:pic xmlns:pic="http://schemas.openxmlformats.org/drawingml/2006/picture">
+                  <pic:nvPicPr>
+                    <pic:cNvPr id="218012701" name=""/>
+                    <pic:cNvPicPr/>
+                  </pic:nvPicPr>
+                  <pic:blipFill>
+                    <a:blip r:embed="rId25"/>
+                    <a:stretch>
+                      <a:fillRect/>
+                    </a:stretch>
+                  </pic:blipFill>
+                  <pic:spPr>
+                    <a:xfrm>
+                      <a:off x="0" y="0"/>
+                      <a:ext cx="1984924" cy="2351999"/>
+                    </a:xfrm>
+                    <a:prstGeom prst="rect">
+                      <a:avLst/>
+                    </a:prstGeom>
+                  </pic:spPr>
+                </pic:pic>
+              </a:graphicData>
+            </a:graphic>
+          </wp:inline>
+        </w:drawing>
+      </w:r>
+    </w:p>
     <w:sectPr>
       <w:pgSz w:w="11906" w:h="16838"/>
       <w:pgMar w:top="1440" w:right="1440" w:bottom="1440" w:left="1440" w:header="708" w:footer="708" w:gutter="0"/>
@@ -461,6 +2556,119 @@
     </w:lvl>
   </w:abstractNum>
   <w:abstractNum w:abstractNumId="2" w15:restartNumberingAfterBreak="0">
+    <w:nsid w:val="356F1F03"/>
+    <w:multiLevelType w:val="hybridMultilevel"/>
+    <w:tmpl w:val="E3863AF0"/>
+    <w:lvl w:ilvl="0" w:tplc="18090001">
+      <w:start w:val="1"/>
+      <w:numFmt w:val="bullet"/>
+      <w:lvlText w:val=""/>
+      <w:lvlJc w:val="left"/>
+      <w:pPr>
+        <w:ind w:left="720" w:hanging="360"/>
+      </w:pPr>
+      <w:rPr>
+        <w:rFonts w:ascii="Symbol" w:hAnsi="Symbol" w:hint="default"/>
+      </w:rPr>
+    </w:lvl>
+    <w:lvl w:ilvl="1" w:tplc="18090003" w:tentative="1">
+      <w:start w:val="1"/>
+      <w:numFmt w:val="bullet"/>
+      <w:lvlText w:val="o"/>
+      <w:lvlJc w:val="left"/>
+      <w:pPr>
+        <w:ind w:left="1440" w:hanging="360"/>
+      </w:pPr>
+      <w:rPr>
+        <w:rFonts w:ascii="Courier New" w:hAnsi="Courier New" w:cs="Courier New" w:hint="default"/>
+      </w:rPr>
+    </w:lvl>
+    <w:lvl w:ilvl="2" w:tplc="18090005" w:tentative="1">
+      <w:start w:val="1"/>
+      <w:numFmt w:val="bullet"/>
+      <w:lvlText w:val=""/>
+      <w:lvlJc w:val="left"/>
+      <w:pPr>
+        <w:ind w:left="2160" w:hanging="360"/>
+      </w:pPr>
+      <w:rPr>
+        <w:rFonts w:ascii="Wingdings" w:hAnsi="Wingdings" w:hint="default"/>
+      </w:rPr>
+    </w:lvl>
+    <w:lvl w:ilvl="3" w:tplc="18090001" w:tentative="1">
+      <w:start w:val="1"/>
+      <w:numFmt w:val="bullet"/>
+      <w:lvlText w:val=""/>
+      <w:lvlJc w:val="left"/>
+      <w:pPr>
+        <w:ind w:left="2880" w:hanging="360"/>
+      </w:pPr>
+      <w:rPr>
+        <w:rFonts w:ascii="Symbol" w:hAnsi="Symbol" w:hint="default"/>
+      </w:rPr>
+    </w:lvl>
+    <w:lvl w:ilvl="4" w:tplc="18090003" w:tentative="1">
+      <w:start w:val="1"/>
+      <w:numFmt w:val="bullet"/>
+      <w:lvlText w:val="o"/>
+      <w:lvlJc w:val="left"/>
+      <w:pPr>
+        <w:ind w:left="3600" w:hanging="360"/>
+      </w:pPr>
+      <w:rPr>
+        <w:rFonts w:ascii="Courier New" w:hAnsi="Courier New" w:cs="Courier New" w:hint="default"/>
+      </w:rPr>
+    </w:lvl>
+    <w:lvl w:ilvl="5" w:tplc="18090005" w:tentative="1">
+      <w:start w:val="1"/>
+      <w:numFmt w:val="bullet"/>
+      <w:lvlText w:val=""/>
+      <w:lvlJc w:val="left"/>
+      <w:pPr>
+        <w:ind w:left="4320" w:hanging="360"/>
+      </w:pPr>
+      <w:rPr>
+        <w:rFonts w:ascii="Wingdings" w:hAnsi="Wingdings" w:hint="default"/>
+      </w:rPr>
+    </w:lvl>
+    <w:lvl w:ilvl="6" w:tplc="18090001" w:tentative="1">
+      <w:start w:val="1"/>
+      <w:numFmt w:val="bullet"/>
+      <w:lvlText w:val=""/>
+      <w:lvlJc w:val="left"/>
+      <w:pPr>
+        <w:ind w:left="5040" w:hanging="360"/>
+      </w:pPr>
+      <w:rPr>
+        <w:rFonts w:ascii="Symbol" w:hAnsi="Symbol" w:hint="default"/>
+      </w:rPr>
+    </w:lvl>
+    <w:lvl w:ilvl="7" w:tplc="18090003" w:tentative="1">
+      <w:start w:val="1"/>
+      <w:numFmt w:val="bullet"/>
+      <w:lvlText w:val="o"/>
+      <w:lvlJc w:val="left"/>
+      <w:pPr>
+        <w:ind w:left="5760" w:hanging="360"/>
+      </w:pPr>
+      <w:rPr>
+        <w:rFonts w:ascii="Courier New" w:hAnsi="Courier New" w:cs="Courier New" w:hint="default"/>
+      </w:rPr>
+    </w:lvl>
+    <w:lvl w:ilvl="8" w:tplc="18090005" w:tentative="1">
+      <w:start w:val="1"/>
+      <w:numFmt w:val="bullet"/>
+      <w:lvlText w:val=""/>
+      <w:lvlJc w:val="left"/>
+      <w:pPr>
+        <w:ind w:left="6480" w:hanging="360"/>
+      </w:pPr>
+      <w:rPr>
+        <w:rFonts w:ascii="Wingdings" w:hAnsi="Wingdings" w:hint="default"/>
+      </w:rPr>
+    </w:lvl>
+  </w:abstractNum>
+  <w:abstractNum w:abstractNumId="3" w15:restartNumberingAfterBreak="0">
     <w:nsid w:val="3E2B28B9"/>
     <w:multiLevelType w:val="hybridMultilevel"/>
     <w:tmpl w:val="BCF0E57E"/>
@@ -573,14 +2781,133 @@
       </w:rPr>
     </w:lvl>
   </w:abstractNum>
+  <w:abstractNum w:abstractNumId="4" w15:restartNumberingAfterBreak="0">
+    <w:nsid w:val="60236006"/>
+    <w:multiLevelType w:val="hybridMultilevel"/>
+    <w:tmpl w:val="10281EDC"/>
+    <w:lvl w:ilvl="0" w:tplc="18090001">
+      <w:start w:val="1"/>
+      <w:numFmt w:val="bullet"/>
+      <w:lvlText w:val=""/>
+      <w:lvlJc w:val="left"/>
+      <w:pPr>
+        <w:ind w:left="720" w:hanging="360"/>
+      </w:pPr>
+      <w:rPr>
+        <w:rFonts w:ascii="Symbol" w:hAnsi="Symbol" w:hint="default"/>
+      </w:rPr>
+    </w:lvl>
+    <w:lvl w:ilvl="1" w:tplc="18090003" w:tentative="1">
+      <w:start w:val="1"/>
+      <w:numFmt w:val="bullet"/>
+      <w:lvlText w:val="o"/>
+      <w:lvlJc w:val="left"/>
+      <w:pPr>
+        <w:ind w:left="1440" w:hanging="360"/>
+      </w:pPr>
+      <w:rPr>
+        <w:rFonts w:ascii="Courier New" w:hAnsi="Courier New" w:cs="Courier New" w:hint="default"/>
+      </w:rPr>
+    </w:lvl>
+    <w:lvl w:ilvl="2" w:tplc="18090005" w:tentative="1">
+      <w:start w:val="1"/>
+      <w:numFmt w:val="bullet"/>
+      <w:lvlText w:val=""/>
+      <w:lvlJc w:val="left"/>
+      <w:pPr>
+        <w:ind w:left="2160" w:hanging="360"/>
+      </w:pPr>
+      <w:rPr>
+        <w:rFonts w:ascii="Wingdings" w:hAnsi="Wingdings" w:hint="default"/>
+      </w:rPr>
+    </w:lvl>
+    <w:lvl w:ilvl="3" w:tplc="18090001" w:tentative="1">
+      <w:start w:val="1"/>
+      <w:numFmt w:val="bullet"/>
+      <w:lvlText w:val=""/>
+      <w:lvlJc w:val="left"/>
+      <w:pPr>
+        <w:ind w:left="2880" w:hanging="360"/>
+      </w:pPr>
+      <w:rPr>
+        <w:rFonts w:ascii="Symbol" w:hAnsi="Symbol" w:hint="default"/>
+      </w:rPr>
+    </w:lvl>
+    <w:lvl w:ilvl="4" w:tplc="18090003" w:tentative="1">
+      <w:start w:val="1"/>
+      <w:numFmt w:val="bullet"/>
+      <w:lvlText w:val="o"/>
+      <w:lvlJc w:val="left"/>
+      <w:pPr>
+        <w:ind w:left="3600" w:hanging="360"/>
+      </w:pPr>
+      <w:rPr>
+        <w:rFonts w:ascii="Courier New" w:hAnsi="Courier New" w:cs="Courier New" w:hint="default"/>
+      </w:rPr>
+    </w:lvl>
+    <w:lvl w:ilvl="5" w:tplc="18090005" w:tentative="1">
+      <w:start w:val="1"/>
+      <w:numFmt w:val="bullet"/>
+      <w:lvlText w:val=""/>
+      <w:lvlJc w:val="left"/>
+      <w:pPr>
+        <w:ind w:left="4320" w:hanging="360"/>
+      </w:pPr>
+      <w:rPr>
+        <w:rFonts w:ascii="Wingdings" w:hAnsi="Wingdings" w:hint="default"/>
+      </w:rPr>
+    </w:lvl>
+    <w:lvl w:ilvl="6" w:tplc="18090001" w:tentative="1">
+      <w:start w:val="1"/>
+      <w:numFmt w:val="bullet"/>
+      <w:lvlText w:val=""/>
+      <w:lvlJc w:val="left"/>
+      <w:pPr>
+        <w:ind w:left="5040" w:hanging="360"/>
+      </w:pPr>
+      <w:rPr>
+        <w:rFonts w:ascii="Symbol" w:hAnsi="Symbol" w:hint="default"/>
+      </w:rPr>
+    </w:lvl>
+    <w:lvl w:ilvl="7" w:tplc="18090003" w:tentative="1">
+      <w:start w:val="1"/>
+      <w:numFmt w:val="bullet"/>
+      <w:lvlText w:val="o"/>
+      <w:lvlJc w:val="left"/>
+      <w:pPr>
+        <w:ind w:left="5760" w:hanging="360"/>
+      </w:pPr>
+      <w:rPr>
+        <w:rFonts w:ascii="Courier New" w:hAnsi="Courier New" w:cs="Courier New" w:hint="default"/>
+      </w:rPr>
+    </w:lvl>
+    <w:lvl w:ilvl="8" w:tplc="18090005" w:tentative="1">
+      <w:start w:val="1"/>
+      <w:numFmt w:val="bullet"/>
+      <w:lvlText w:val=""/>
+      <w:lvlJc w:val="left"/>
+      <w:pPr>
+        <w:ind w:left="6480" w:hanging="360"/>
+      </w:pPr>
+      <w:rPr>
+        <w:rFonts w:ascii="Wingdings" w:hAnsi="Wingdings" w:hint="default"/>
+      </w:rPr>
+    </w:lvl>
+  </w:abstractNum>
   <w:num w:numId="1" w16cid:durableId="968126866">
-    <w:abstractNumId w:val="2"/>
+    <w:abstractNumId w:val="3"/>
   </w:num>
   <w:num w:numId="2" w16cid:durableId="791241090">
     <w:abstractNumId w:val="0"/>
   </w:num>
   <w:num w:numId="3" w16cid:durableId="211575384">
     <w:abstractNumId w:val="1"/>
+  </w:num>
+  <w:num w:numId="4" w16cid:durableId="830604546">
+    <w:abstractNumId w:val="4"/>
+  </w:num>
+  <w:num w:numId="5" w16cid:durableId="612051187">
+    <w:abstractNumId w:val="2"/>
   </w:num>
 </w:numbering>
 </file>
@@ -1013,7 +3340,6 @@
     <w:next w:val="Normal"/>
     <w:link w:val="Heading2Char"/>
     <w:uiPriority w:val="9"/>
-    <w:semiHidden/>
     <w:unhideWhenUsed/>
     <w:qFormat/>
     <w:rsid w:val="0093608F"/>
@@ -1230,7 +3556,6 @@
     <w:basedOn w:val="DefaultParagraphFont"/>
     <w:link w:val="Heading2"/>
     <w:uiPriority w:val="9"/>
-    <w:semiHidden/>
     <w:rsid w:val="0093608F"/>
     <w:rPr>
       <w:rFonts w:asciiTheme="majorHAnsi" w:eastAsiaTheme="majorEastAsia" w:hAnsiTheme="majorHAnsi" w:cstheme="majorBidi"/>
@@ -1513,6 +3838,673 @@
       <w:iCs/>
       <w:color w:val="404040" w:themeColor="text1" w:themeTint="BF"/>
     </w:rPr>
+  </w:style>
+  <w:style w:type="table" w:styleId="TableGrid">
+    <w:name w:val="Table Grid"/>
+    <w:basedOn w:val="TableNormal"/>
+    <w:uiPriority w:val="39"/>
+    <w:rsid w:val="00593166"/>
+    <w:pPr>
+      <w:spacing w:after="0" w:line="240" w:lineRule="auto"/>
+    </w:pPr>
+    <w:tblPr>
+      <w:tblBorders>
+        <w:top w:val="single" w:sz="4" w:space="0" w:color="auto"/>
+        <w:left w:val="single" w:sz="4" w:space="0" w:color="auto"/>
+        <w:bottom w:val="single" w:sz="4" w:space="0" w:color="auto"/>
+        <w:right w:val="single" w:sz="4" w:space="0" w:color="auto"/>
+        <w:insideH w:val="single" w:sz="4" w:space="0" w:color="auto"/>
+        <w:insideV w:val="single" w:sz="4" w:space="0" w:color="auto"/>
+      </w:tblBorders>
+    </w:tblPr>
+  </w:style>
+  <w:style w:type="table" w:styleId="ListTable5Dark-Accent5">
+    <w:name w:val="List Table 5 Dark Accent 5"/>
+    <w:basedOn w:val="TableNormal"/>
+    <w:uiPriority w:val="50"/>
+    <w:rsid w:val="00593166"/>
+    <w:pPr>
+      <w:spacing w:after="0" w:line="240" w:lineRule="auto"/>
+    </w:pPr>
+    <w:rPr>
+      <w:color w:val="FFFFFF" w:themeColor="background1"/>
+    </w:rPr>
+    <w:tblPr>
+      <w:tblStyleRowBandSize w:val="1"/>
+      <w:tblStyleColBandSize w:val="1"/>
+      <w:tblBorders>
+        <w:top w:val="single" w:sz="24" w:space="0" w:color="A02B93" w:themeColor="accent5"/>
+        <w:left w:val="single" w:sz="24" w:space="0" w:color="A02B93" w:themeColor="accent5"/>
+        <w:bottom w:val="single" w:sz="24" w:space="0" w:color="A02B93" w:themeColor="accent5"/>
+        <w:right w:val="single" w:sz="24" w:space="0" w:color="A02B93" w:themeColor="accent5"/>
+      </w:tblBorders>
+    </w:tblPr>
+    <w:tcPr>
+      <w:shd w:val="clear" w:color="auto" w:fill="A02B93" w:themeFill="accent5"/>
+    </w:tcPr>
+    <w:tblStylePr w:type="firstRow">
+      <w:rPr>
+        <w:b/>
+        <w:bCs/>
+      </w:rPr>
+      <w:tblPr/>
+      <w:tcPr>
+        <w:tcBorders>
+          <w:bottom w:val="single" w:sz="18" w:space="0" w:color="FFFFFF" w:themeColor="background1"/>
+        </w:tcBorders>
+      </w:tcPr>
+    </w:tblStylePr>
+    <w:tblStylePr w:type="lastRow">
+      <w:rPr>
+        <w:b/>
+        <w:bCs/>
+      </w:rPr>
+      <w:tblPr/>
+      <w:tcPr>
+        <w:tcBorders>
+          <w:top w:val="single" w:sz="4" w:space="0" w:color="FFFFFF" w:themeColor="background1"/>
+        </w:tcBorders>
+      </w:tcPr>
+    </w:tblStylePr>
+    <w:tblStylePr w:type="firstCol">
+      <w:rPr>
+        <w:b/>
+        <w:bCs/>
+      </w:rPr>
+      <w:tblPr/>
+      <w:tcPr>
+        <w:tcBorders>
+          <w:right w:val="single" w:sz="4" w:space="0" w:color="FFFFFF" w:themeColor="background1"/>
+        </w:tcBorders>
+      </w:tcPr>
+    </w:tblStylePr>
+    <w:tblStylePr w:type="lastCol">
+      <w:rPr>
+        <w:b/>
+        <w:bCs/>
+      </w:rPr>
+      <w:tblPr/>
+      <w:tcPr>
+        <w:tcBorders>
+          <w:left w:val="single" w:sz="4" w:space="0" w:color="FFFFFF" w:themeColor="background1"/>
+        </w:tcBorders>
+      </w:tcPr>
+    </w:tblStylePr>
+    <w:tblStylePr w:type="band1Vert">
+      <w:tblPr/>
+      <w:tcPr>
+        <w:tcBorders>
+          <w:left w:val="single" w:sz="4" w:space="0" w:color="FFFFFF" w:themeColor="background1"/>
+          <w:right w:val="single" w:sz="4" w:space="0" w:color="FFFFFF" w:themeColor="background1"/>
+        </w:tcBorders>
+      </w:tcPr>
+    </w:tblStylePr>
+    <w:tblStylePr w:type="band2Vert">
+      <w:tblPr/>
+      <w:tcPr>
+        <w:tcBorders>
+          <w:left w:val="single" w:sz="4" w:space="0" w:color="FFFFFF" w:themeColor="background1"/>
+          <w:right w:val="single" w:sz="4" w:space="0" w:color="FFFFFF" w:themeColor="background1"/>
+        </w:tcBorders>
+      </w:tcPr>
+    </w:tblStylePr>
+    <w:tblStylePr w:type="band1Horz">
+      <w:tblPr/>
+      <w:tcPr>
+        <w:tcBorders>
+          <w:top w:val="single" w:sz="4" w:space="0" w:color="FFFFFF" w:themeColor="background1"/>
+          <w:bottom w:val="single" w:sz="4" w:space="0" w:color="FFFFFF" w:themeColor="background1"/>
+        </w:tcBorders>
+      </w:tcPr>
+    </w:tblStylePr>
+    <w:tblStylePr w:type="neCell">
+      <w:tblPr/>
+      <w:tcPr>
+        <w:tcBorders>
+          <w:left w:val="nil"/>
+        </w:tcBorders>
+      </w:tcPr>
+    </w:tblStylePr>
+    <w:tblStylePr w:type="nwCell">
+      <w:tblPr/>
+      <w:tcPr>
+        <w:tcBorders>
+          <w:right w:val="nil"/>
+        </w:tcBorders>
+      </w:tcPr>
+    </w:tblStylePr>
+    <w:tblStylePr w:type="seCell">
+      <w:tblPr/>
+      <w:tcPr>
+        <w:tcBorders>
+          <w:top w:val="nil"/>
+          <w:left w:val="nil"/>
+        </w:tcBorders>
+      </w:tcPr>
+    </w:tblStylePr>
+    <w:tblStylePr w:type="swCell">
+      <w:tblPr/>
+      <w:tcPr>
+        <w:tcBorders>
+          <w:top w:val="nil"/>
+          <w:right w:val="nil"/>
+        </w:tcBorders>
+      </w:tcPr>
+    </w:tblStylePr>
+  </w:style>
+  <w:style w:type="table" w:styleId="GridTable1Light-Accent6">
+    <w:name w:val="Grid Table 1 Light Accent 6"/>
+    <w:basedOn w:val="TableNormal"/>
+    <w:uiPriority w:val="46"/>
+    <w:rsid w:val="00593166"/>
+    <w:pPr>
+      <w:spacing w:after="0" w:line="240" w:lineRule="auto"/>
+    </w:pPr>
+    <w:tblPr>
+      <w:tblStyleRowBandSize w:val="1"/>
+      <w:tblStyleColBandSize w:val="1"/>
+      <w:tblBorders>
+        <w:top w:val="single" w:sz="4" w:space="0" w:color="B3E5A1" w:themeColor="accent6" w:themeTint="66"/>
+        <w:left w:val="single" w:sz="4" w:space="0" w:color="B3E5A1" w:themeColor="accent6" w:themeTint="66"/>
+        <w:bottom w:val="single" w:sz="4" w:space="0" w:color="B3E5A1" w:themeColor="accent6" w:themeTint="66"/>
+        <w:right w:val="single" w:sz="4" w:space="0" w:color="B3E5A1" w:themeColor="accent6" w:themeTint="66"/>
+        <w:insideH w:val="single" w:sz="4" w:space="0" w:color="B3E5A1" w:themeColor="accent6" w:themeTint="66"/>
+        <w:insideV w:val="single" w:sz="4" w:space="0" w:color="B3E5A1" w:themeColor="accent6" w:themeTint="66"/>
+      </w:tblBorders>
+    </w:tblPr>
+    <w:tblStylePr w:type="firstRow">
+      <w:rPr>
+        <w:b/>
+        <w:bCs/>
+      </w:rPr>
+      <w:tblPr/>
+      <w:tcPr>
+        <w:tcBorders>
+          <w:bottom w:val="single" w:sz="12" w:space="0" w:color="8DD873" w:themeColor="accent6" w:themeTint="99"/>
+        </w:tcBorders>
+      </w:tcPr>
+    </w:tblStylePr>
+    <w:tblStylePr w:type="lastRow">
+      <w:rPr>
+        <w:b/>
+        <w:bCs/>
+      </w:rPr>
+      <w:tblPr/>
+      <w:tcPr>
+        <w:tcBorders>
+          <w:top w:val="double" w:sz="2" w:space="0" w:color="8DD873" w:themeColor="accent6" w:themeTint="99"/>
+        </w:tcBorders>
+      </w:tcPr>
+    </w:tblStylePr>
+    <w:tblStylePr w:type="firstCol">
+      <w:rPr>
+        <w:b/>
+        <w:bCs/>
+      </w:rPr>
+    </w:tblStylePr>
+    <w:tblStylePr w:type="lastCol">
+      <w:rPr>
+        <w:b/>
+        <w:bCs/>
+      </w:rPr>
+    </w:tblStylePr>
+  </w:style>
+  <w:style w:type="table" w:styleId="GridTable4-Accent1">
+    <w:name w:val="Grid Table 4 Accent 1"/>
+    <w:basedOn w:val="TableNormal"/>
+    <w:uiPriority w:val="49"/>
+    <w:rsid w:val="00593166"/>
+    <w:pPr>
+      <w:spacing w:after="0" w:line="240" w:lineRule="auto"/>
+    </w:pPr>
+    <w:tblPr>
+      <w:tblStyleRowBandSize w:val="1"/>
+      <w:tblStyleColBandSize w:val="1"/>
+      <w:tblBorders>
+        <w:top w:val="single" w:sz="4" w:space="0" w:color="45B0E1" w:themeColor="accent1" w:themeTint="99"/>
+        <w:left w:val="single" w:sz="4" w:space="0" w:color="45B0E1" w:themeColor="accent1" w:themeTint="99"/>
+        <w:bottom w:val="single" w:sz="4" w:space="0" w:color="45B0E1" w:themeColor="accent1" w:themeTint="99"/>
+        <w:right w:val="single" w:sz="4" w:space="0" w:color="45B0E1" w:themeColor="accent1" w:themeTint="99"/>
+        <w:insideH w:val="single" w:sz="4" w:space="0" w:color="45B0E1" w:themeColor="accent1" w:themeTint="99"/>
+        <w:insideV w:val="single" w:sz="4" w:space="0" w:color="45B0E1" w:themeColor="accent1" w:themeTint="99"/>
+      </w:tblBorders>
+    </w:tblPr>
+    <w:tblStylePr w:type="firstRow">
+      <w:rPr>
+        <w:b/>
+        <w:bCs/>
+        <w:color w:val="FFFFFF" w:themeColor="background1"/>
+      </w:rPr>
+      <w:tblPr/>
+      <w:tcPr>
+        <w:tcBorders>
+          <w:top w:val="single" w:sz="4" w:space="0" w:color="156082" w:themeColor="accent1"/>
+          <w:left w:val="single" w:sz="4" w:space="0" w:color="156082" w:themeColor="accent1"/>
+          <w:bottom w:val="single" w:sz="4" w:space="0" w:color="156082" w:themeColor="accent1"/>
+          <w:right w:val="single" w:sz="4" w:space="0" w:color="156082" w:themeColor="accent1"/>
+          <w:insideH w:val="nil"/>
+          <w:insideV w:val="nil"/>
+        </w:tcBorders>
+        <w:shd w:val="clear" w:color="auto" w:fill="156082" w:themeFill="accent1"/>
+      </w:tcPr>
+    </w:tblStylePr>
+    <w:tblStylePr w:type="lastRow">
+      <w:rPr>
+        <w:b/>
+        <w:bCs/>
+      </w:rPr>
+      <w:tblPr/>
+      <w:tcPr>
+        <w:tcBorders>
+          <w:top w:val="double" w:sz="4" w:space="0" w:color="156082" w:themeColor="accent1"/>
+        </w:tcBorders>
+      </w:tcPr>
+    </w:tblStylePr>
+    <w:tblStylePr w:type="firstCol">
+      <w:rPr>
+        <w:b/>
+        <w:bCs/>
+      </w:rPr>
+    </w:tblStylePr>
+    <w:tblStylePr w:type="lastCol">
+      <w:rPr>
+        <w:b/>
+        <w:bCs/>
+      </w:rPr>
+    </w:tblStylePr>
+    <w:tblStylePr w:type="band1Vert">
+      <w:tblPr/>
+      <w:tcPr>
+        <w:shd w:val="clear" w:color="auto" w:fill="C1E4F5" w:themeFill="accent1" w:themeFillTint="33"/>
+      </w:tcPr>
+    </w:tblStylePr>
+    <w:tblStylePr w:type="band1Horz">
+      <w:tblPr/>
+      <w:tcPr>
+        <w:shd w:val="clear" w:color="auto" w:fill="C1E4F5" w:themeFill="accent1" w:themeFillTint="33"/>
+      </w:tcPr>
+    </w:tblStylePr>
+  </w:style>
+  <w:style w:type="table" w:styleId="GridTable3">
+    <w:name w:val="Grid Table 3"/>
+    <w:basedOn w:val="TableNormal"/>
+    <w:uiPriority w:val="48"/>
+    <w:rsid w:val="00212DFC"/>
+    <w:pPr>
+      <w:spacing w:after="0" w:line="240" w:lineRule="auto"/>
+    </w:pPr>
+    <w:tblPr>
+      <w:tblStyleRowBandSize w:val="1"/>
+      <w:tblStyleColBandSize w:val="1"/>
+      <w:tblBorders>
+        <w:top w:val="single" w:sz="4" w:space="0" w:color="666666" w:themeColor="text1" w:themeTint="99"/>
+        <w:left w:val="single" w:sz="4" w:space="0" w:color="666666" w:themeColor="text1" w:themeTint="99"/>
+        <w:bottom w:val="single" w:sz="4" w:space="0" w:color="666666" w:themeColor="text1" w:themeTint="99"/>
+        <w:right w:val="single" w:sz="4" w:space="0" w:color="666666" w:themeColor="text1" w:themeTint="99"/>
+        <w:insideH w:val="single" w:sz="4" w:space="0" w:color="666666" w:themeColor="text1" w:themeTint="99"/>
+        <w:insideV w:val="single" w:sz="4" w:space="0" w:color="666666" w:themeColor="text1" w:themeTint="99"/>
+      </w:tblBorders>
+    </w:tblPr>
+    <w:tblStylePr w:type="firstRow">
+      <w:rPr>
+        <w:b/>
+        <w:bCs/>
+      </w:rPr>
+      <w:tblPr/>
+      <w:tcPr>
+        <w:tcBorders>
+          <w:top w:val="nil"/>
+          <w:left w:val="nil"/>
+          <w:right w:val="nil"/>
+          <w:insideH w:val="nil"/>
+          <w:insideV w:val="nil"/>
+        </w:tcBorders>
+        <w:shd w:val="clear" w:color="auto" w:fill="FFFFFF" w:themeFill="background1"/>
+      </w:tcPr>
+    </w:tblStylePr>
+    <w:tblStylePr w:type="lastRow">
+      <w:rPr>
+        <w:b/>
+        <w:bCs/>
+      </w:rPr>
+      <w:tblPr/>
+      <w:tcPr>
+        <w:tcBorders>
+          <w:left w:val="nil"/>
+          <w:bottom w:val="nil"/>
+          <w:right w:val="nil"/>
+          <w:insideH w:val="nil"/>
+          <w:insideV w:val="nil"/>
+        </w:tcBorders>
+        <w:shd w:val="clear" w:color="auto" w:fill="FFFFFF" w:themeFill="background1"/>
+      </w:tcPr>
+    </w:tblStylePr>
+    <w:tblStylePr w:type="firstCol">
+      <w:pPr>
+        <w:jc w:val="right"/>
+      </w:pPr>
+      <w:rPr>
+        <w:i/>
+        <w:iCs/>
+      </w:rPr>
+      <w:tblPr/>
+      <w:tcPr>
+        <w:tcBorders>
+          <w:top w:val="nil"/>
+          <w:left w:val="nil"/>
+          <w:bottom w:val="nil"/>
+          <w:insideH w:val="nil"/>
+          <w:insideV w:val="nil"/>
+        </w:tcBorders>
+        <w:shd w:val="clear" w:color="auto" w:fill="FFFFFF" w:themeFill="background1"/>
+      </w:tcPr>
+    </w:tblStylePr>
+    <w:tblStylePr w:type="lastCol">
+      <w:rPr>
+        <w:i/>
+        <w:iCs/>
+      </w:rPr>
+      <w:tblPr/>
+      <w:tcPr>
+        <w:tcBorders>
+          <w:top w:val="nil"/>
+          <w:bottom w:val="nil"/>
+          <w:right w:val="nil"/>
+          <w:insideH w:val="nil"/>
+          <w:insideV w:val="nil"/>
+        </w:tcBorders>
+        <w:shd w:val="clear" w:color="auto" w:fill="FFFFFF" w:themeFill="background1"/>
+      </w:tcPr>
+    </w:tblStylePr>
+    <w:tblStylePr w:type="band1Vert">
+      <w:tblPr/>
+      <w:tcPr>
+        <w:shd w:val="clear" w:color="auto" w:fill="CCCCCC" w:themeFill="text1" w:themeFillTint="33"/>
+      </w:tcPr>
+    </w:tblStylePr>
+    <w:tblStylePr w:type="band1Horz">
+      <w:tblPr/>
+      <w:tcPr>
+        <w:shd w:val="clear" w:color="auto" w:fill="CCCCCC" w:themeFill="text1" w:themeFillTint="33"/>
+      </w:tcPr>
+    </w:tblStylePr>
+    <w:tblStylePr w:type="neCell">
+      <w:tblPr/>
+      <w:tcPr>
+        <w:tcBorders>
+          <w:bottom w:val="single" w:sz="4" w:space="0" w:color="666666" w:themeColor="text1" w:themeTint="99"/>
+        </w:tcBorders>
+      </w:tcPr>
+    </w:tblStylePr>
+    <w:tblStylePr w:type="nwCell">
+      <w:tblPr/>
+      <w:tcPr>
+        <w:tcBorders>
+          <w:bottom w:val="single" w:sz="4" w:space="0" w:color="666666" w:themeColor="text1" w:themeTint="99"/>
+        </w:tcBorders>
+      </w:tcPr>
+    </w:tblStylePr>
+    <w:tblStylePr w:type="seCell">
+      <w:tblPr/>
+      <w:tcPr>
+        <w:tcBorders>
+          <w:top w:val="single" w:sz="4" w:space="0" w:color="666666" w:themeColor="text1" w:themeTint="99"/>
+        </w:tcBorders>
+      </w:tcPr>
+    </w:tblStylePr>
+    <w:tblStylePr w:type="swCell">
+      <w:tblPr/>
+      <w:tcPr>
+        <w:tcBorders>
+          <w:top w:val="single" w:sz="4" w:space="0" w:color="666666" w:themeColor="text1" w:themeTint="99"/>
+        </w:tcBorders>
+      </w:tcPr>
+    </w:tblStylePr>
+  </w:style>
+  <w:style w:type="table" w:styleId="GridTable7Colorful">
+    <w:name w:val="Grid Table 7 Colorful"/>
+    <w:basedOn w:val="TableNormal"/>
+    <w:uiPriority w:val="52"/>
+    <w:rsid w:val="00212DFC"/>
+    <w:pPr>
+      <w:spacing w:after="0" w:line="240" w:lineRule="auto"/>
+    </w:pPr>
+    <w:rPr>
+      <w:color w:val="000000" w:themeColor="text1"/>
+    </w:rPr>
+    <w:tblPr>
+      <w:tblStyleRowBandSize w:val="1"/>
+      <w:tblStyleColBandSize w:val="1"/>
+      <w:tblBorders>
+        <w:top w:val="single" w:sz="4" w:space="0" w:color="666666" w:themeColor="text1" w:themeTint="99"/>
+        <w:left w:val="single" w:sz="4" w:space="0" w:color="666666" w:themeColor="text1" w:themeTint="99"/>
+        <w:bottom w:val="single" w:sz="4" w:space="0" w:color="666666" w:themeColor="text1" w:themeTint="99"/>
+        <w:right w:val="single" w:sz="4" w:space="0" w:color="666666" w:themeColor="text1" w:themeTint="99"/>
+        <w:insideH w:val="single" w:sz="4" w:space="0" w:color="666666" w:themeColor="text1" w:themeTint="99"/>
+        <w:insideV w:val="single" w:sz="4" w:space="0" w:color="666666" w:themeColor="text1" w:themeTint="99"/>
+      </w:tblBorders>
+    </w:tblPr>
+    <w:tblStylePr w:type="firstRow">
+      <w:rPr>
+        <w:b/>
+        <w:bCs/>
+      </w:rPr>
+      <w:tblPr/>
+      <w:tcPr>
+        <w:tcBorders>
+          <w:top w:val="nil"/>
+          <w:left w:val="nil"/>
+          <w:right w:val="nil"/>
+          <w:insideH w:val="nil"/>
+          <w:insideV w:val="nil"/>
+        </w:tcBorders>
+        <w:shd w:val="clear" w:color="auto" w:fill="FFFFFF" w:themeFill="background1"/>
+      </w:tcPr>
+    </w:tblStylePr>
+    <w:tblStylePr w:type="lastRow">
+      <w:rPr>
+        <w:b/>
+        <w:bCs/>
+      </w:rPr>
+      <w:tblPr/>
+      <w:tcPr>
+        <w:tcBorders>
+          <w:left w:val="nil"/>
+          <w:bottom w:val="nil"/>
+          <w:right w:val="nil"/>
+          <w:insideH w:val="nil"/>
+          <w:insideV w:val="nil"/>
+        </w:tcBorders>
+        <w:shd w:val="clear" w:color="auto" w:fill="FFFFFF" w:themeFill="background1"/>
+      </w:tcPr>
+    </w:tblStylePr>
+    <w:tblStylePr w:type="firstCol">
+      <w:pPr>
+        <w:jc w:val="right"/>
+      </w:pPr>
+      <w:rPr>
+        <w:i/>
+        <w:iCs/>
+      </w:rPr>
+      <w:tblPr/>
+      <w:tcPr>
+        <w:tcBorders>
+          <w:top w:val="nil"/>
+          <w:left w:val="nil"/>
+          <w:bottom w:val="nil"/>
+          <w:insideH w:val="nil"/>
+          <w:insideV w:val="nil"/>
+        </w:tcBorders>
+        <w:shd w:val="clear" w:color="auto" w:fill="FFFFFF" w:themeFill="background1"/>
+      </w:tcPr>
+    </w:tblStylePr>
+    <w:tblStylePr w:type="lastCol">
+      <w:rPr>
+        <w:i/>
+        <w:iCs/>
+      </w:rPr>
+      <w:tblPr/>
+      <w:tcPr>
+        <w:tcBorders>
+          <w:top w:val="nil"/>
+          <w:bottom w:val="nil"/>
+          <w:right w:val="nil"/>
+          <w:insideH w:val="nil"/>
+          <w:insideV w:val="nil"/>
+        </w:tcBorders>
+        <w:shd w:val="clear" w:color="auto" w:fill="FFFFFF" w:themeFill="background1"/>
+      </w:tcPr>
+    </w:tblStylePr>
+    <w:tblStylePr w:type="band1Vert">
+      <w:tblPr/>
+      <w:tcPr>
+        <w:shd w:val="clear" w:color="auto" w:fill="CCCCCC" w:themeFill="text1" w:themeFillTint="33"/>
+      </w:tcPr>
+    </w:tblStylePr>
+    <w:tblStylePr w:type="band1Horz">
+      <w:tblPr/>
+      <w:tcPr>
+        <w:shd w:val="clear" w:color="auto" w:fill="CCCCCC" w:themeFill="text1" w:themeFillTint="33"/>
+      </w:tcPr>
+    </w:tblStylePr>
+    <w:tblStylePr w:type="neCell">
+      <w:tblPr/>
+      <w:tcPr>
+        <w:tcBorders>
+          <w:bottom w:val="single" w:sz="4" w:space="0" w:color="666666" w:themeColor="text1" w:themeTint="99"/>
+        </w:tcBorders>
+      </w:tcPr>
+    </w:tblStylePr>
+    <w:tblStylePr w:type="nwCell">
+      <w:tblPr/>
+      <w:tcPr>
+        <w:tcBorders>
+          <w:bottom w:val="single" w:sz="4" w:space="0" w:color="666666" w:themeColor="text1" w:themeTint="99"/>
+        </w:tcBorders>
+      </w:tcPr>
+    </w:tblStylePr>
+    <w:tblStylePr w:type="seCell">
+      <w:tblPr/>
+      <w:tcPr>
+        <w:tcBorders>
+          <w:top w:val="single" w:sz="4" w:space="0" w:color="666666" w:themeColor="text1" w:themeTint="99"/>
+        </w:tcBorders>
+      </w:tcPr>
+    </w:tblStylePr>
+    <w:tblStylePr w:type="swCell">
+      <w:tblPr/>
+      <w:tcPr>
+        <w:tcBorders>
+          <w:top w:val="single" w:sz="4" w:space="0" w:color="666666" w:themeColor="text1" w:themeTint="99"/>
+        </w:tcBorders>
+      </w:tcPr>
+    </w:tblStylePr>
+  </w:style>
+  <w:style w:type="table" w:styleId="GridTable5Dark-Accent1">
+    <w:name w:val="Grid Table 5 Dark Accent 1"/>
+    <w:basedOn w:val="TableNormal"/>
+    <w:uiPriority w:val="50"/>
+    <w:rsid w:val="00212DFC"/>
+    <w:pPr>
+      <w:spacing w:after="0" w:line="240" w:lineRule="auto"/>
+    </w:pPr>
+    <w:tblPr>
+      <w:tblStyleRowBandSize w:val="1"/>
+      <w:tblStyleColBandSize w:val="1"/>
+      <w:tblBorders>
+        <w:top w:val="single" w:sz="4" w:space="0" w:color="FFFFFF" w:themeColor="background1"/>
+        <w:left w:val="single" w:sz="4" w:space="0" w:color="FFFFFF" w:themeColor="background1"/>
+        <w:bottom w:val="single" w:sz="4" w:space="0" w:color="FFFFFF" w:themeColor="background1"/>
+        <w:right w:val="single" w:sz="4" w:space="0" w:color="FFFFFF" w:themeColor="background1"/>
+        <w:insideH w:val="single" w:sz="4" w:space="0" w:color="FFFFFF" w:themeColor="background1"/>
+        <w:insideV w:val="single" w:sz="4" w:space="0" w:color="FFFFFF" w:themeColor="background1"/>
+      </w:tblBorders>
+    </w:tblPr>
+    <w:tcPr>
+      <w:shd w:val="clear" w:color="auto" w:fill="C1E4F5" w:themeFill="accent1" w:themeFillTint="33"/>
+    </w:tcPr>
+    <w:tblStylePr w:type="firstRow">
+      <w:rPr>
+        <w:b/>
+        <w:bCs/>
+        <w:color w:val="FFFFFF" w:themeColor="background1"/>
+      </w:rPr>
+      <w:tblPr/>
+      <w:tcPr>
+        <w:tcBorders>
+          <w:top w:val="single" w:sz="4" w:space="0" w:color="FFFFFF" w:themeColor="background1"/>
+          <w:left w:val="single" w:sz="4" w:space="0" w:color="FFFFFF" w:themeColor="background1"/>
+          <w:right w:val="single" w:sz="4" w:space="0" w:color="FFFFFF" w:themeColor="background1"/>
+          <w:insideH w:val="nil"/>
+          <w:insideV w:val="nil"/>
+        </w:tcBorders>
+        <w:shd w:val="clear" w:color="auto" w:fill="156082" w:themeFill="accent1"/>
+      </w:tcPr>
+    </w:tblStylePr>
+    <w:tblStylePr w:type="lastRow">
+      <w:rPr>
+        <w:b/>
+        <w:bCs/>
+        <w:color w:val="FFFFFF" w:themeColor="background1"/>
+      </w:rPr>
+      <w:tblPr/>
+      <w:tcPr>
+        <w:tcBorders>
+          <w:left w:val="single" w:sz="4" w:space="0" w:color="FFFFFF" w:themeColor="background1"/>
+          <w:bottom w:val="single" w:sz="4" w:space="0" w:color="FFFFFF" w:themeColor="background1"/>
+          <w:right w:val="single" w:sz="4" w:space="0" w:color="FFFFFF" w:themeColor="background1"/>
+          <w:insideH w:val="nil"/>
+          <w:insideV w:val="nil"/>
+        </w:tcBorders>
+        <w:shd w:val="clear" w:color="auto" w:fill="156082" w:themeFill="accent1"/>
+      </w:tcPr>
+    </w:tblStylePr>
+    <w:tblStylePr w:type="firstCol">
+      <w:rPr>
+        <w:b/>
+        <w:bCs/>
+        <w:color w:val="FFFFFF" w:themeColor="background1"/>
+      </w:rPr>
+      <w:tblPr/>
+      <w:tcPr>
+        <w:tcBorders>
+          <w:top w:val="single" w:sz="4" w:space="0" w:color="FFFFFF" w:themeColor="background1"/>
+          <w:left w:val="single" w:sz="4" w:space="0" w:color="FFFFFF" w:themeColor="background1"/>
+          <w:bottom w:val="single" w:sz="4" w:space="0" w:color="FFFFFF" w:themeColor="background1"/>
+          <w:insideV w:val="nil"/>
+        </w:tcBorders>
+        <w:shd w:val="clear" w:color="auto" w:fill="156082" w:themeFill="accent1"/>
+      </w:tcPr>
+    </w:tblStylePr>
+    <w:tblStylePr w:type="lastCol">
+      <w:rPr>
+        <w:b/>
+        <w:bCs/>
+        <w:color w:val="FFFFFF" w:themeColor="background1"/>
+      </w:rPr>
+      <w:tblPr/>
+      <w:tcPr>
+        <w:tcBorders>
+          <w:top w:val="single" w:sz="4" w:space="0" w:color="FFFFFF" w:themeColor="background1"/>
+          <w:bottom w:val="single" w:sz="4" w:space="0" w:color="FFFFFF" w:themeColor="background1"/>
+          <w:right w:val="single" w:sz="4" w:space="0" w:color="FFFFFF" w:themeColor="background1"/>
+          <w:insideV w:val="nil"/>
+        </w:tcBorders>
+        <w:shd w:val="clear" w:color="auto" w:fill="156082" w:themeFill="accent1"/>
+      </w:tcPr>
+    </w:tblStylePr>
+    <w:tblStylePr w:type="band1Vert">
+      <w:tblPr/>
+      <w:tcPr>
+        <w:shd w:val="clear" w:color="auto" w:fill="83CAEB" w:themeFill="accent1" w:themeFillTint="66"/>
+      </w:tcPr>
+    </w:tblStylePr>
+    <w:tblStylePr w:type="band1Horz">
+      <w:tblPr/>
+      <w:tcPr>
+        <w:shd w:val="clear" w:color="auto" w:fill="83CAEB" w:themeFill="accent1" w:themeFillTint="66"/>
+      </w:tcPr>
+    </w:tblStylePr>
   </w:style>
 </w:styles>
 </file>

</xml_diff>